<commit_message>
Update portfolio to match current resume and expand experience
</commit_message>
<xml_diff>
--- a/Amrit_Prabhu_Resume.docx
+++ b/Amrit_Prabhu_Resume.docx
@@ -7,7 +7,7 @@
         <w:pBdr>
           <w:bottom w:val="single" w:sz="6" w:space="0" w:color="FFFFFF"/>
         </w:pBdr>
-        <w:spacing w:line="220" w:lineRule="atLeast"/>
+        <w:spacing w:line="240" w:lineRule="auto" w:after="0" w:before="0"/>
         <w:jc w:val="center"/>
         <w:rPr>
           <w:sz w:val="22"/>
@@ -31,7 +31,7 @@
         <w:pBdr>
           <w:bottom w:val="single" w:sz="6" w:space="0" w:color="FFFFFF"/>
         </w:pBdr>
-        <w:spacing w:line="220" w:lineRule="atLeast"/>
+        <w:spacing w:line="240" w:lineRule="auto" w:after="0" w:before="0"/>
         <w:jc w:val="center"/>
         <w:rPr>
           <w:sz w:val="22"/>
@@ -44,21 +44,13 @@
         </w:rPr>
         <w:t>Troy, MI | 248-825-6377 | prab2534@kettering.edu | linkedin.com/in/amrit-krishna-prabhu</w:t>
       </w:r>
-    </w:p>
-    <w:p>
-      <w:pPr>
-        <w:rPr>
-          <w:sz w:val="22"/>
-          <w:szCs w:val="22"/>
-        </w:rPr>
-      </w:pPr>
     </w:p>
     <w:p>
       <w:pPr>
         <w:pBdr>
           <w:bottom w:val="single" w:sz="6" w:space="0" w:color="000000"/>
         </w:pBdr>
-        <w:spacing w:line="220" w:lineRule="atLeast"/>
+        <w:spacing w:line="240" w:lineRule="auto" w:after="0" w:before="20"/>
         <w:rPr>
           <w:b/>
           <w:bCs/>
@@ -73,7 +65,7 @@
           <w:b/>
           <w:bCs/>
           <w:caps/>
-          <w:sz w:val="22"/>
+          <w:sz w:val="20"/>
           <w:szCs w:val="22"/>
         </w:rPr>
         <w:t>EDUCATION</w:t>
@@ -83,9 +75,9 @@
     <w:p>
       <w:pPr>
         <w:tabs>
-          <w:tab w:val="right" w:pos="10800"/>
-        </w:tabs>
-        <w:spacing w:line="220" w:lineRule="atLeast"/>
+          <w:tab w:pos="10787" w:val="right"/>
+        </w:tabs>
+        <w:spacing w:line="240" w:lineRule="auto" w:after="0" w:before="0"/>
         <w:rPr>
           <w:sz w:val="22"/>
           <w:szCs w:val="22"/>
@@ -95,52 +87,50 @@
       <w:r>
         <w:rPr>
           <w:rStyle w:val="fs14fw4"/>
-          <w:sz w:val="22"/>
-          <w:szCs w:val="22"/>
-        </w:rPr>
-        <w:t>Kettering University</w:t>
+          <w:sz w:val="20"/>
+          <w:szCs w:val="22"/>
+        </w:rPr>
+        <w:t>Kettering University, Flint, MI</w:t>
+        <w:tab/>
+        <w:t>Oct 2026 – Jun 2030</w:t>
       </w:r>
       <w:bookmarkEnd w:id="6"/>
       <w:r>
         <w:rPr>
           <w:rStyle w:val="fs14fw4undefinedtdn"/>
-          <w:sz w:val="22"/>
-          <w:szCs w:val="22"/>
-        </w:rPr>
-        <w:t xml:space="preserve">, </w:t>
+          <w:sz w:val="20"/>
+          <w:szCs w:val="22"/>
+        </w:rPr>
       </w:r>
       <w:bookmarkStart w:id="7" w:name="div_16"/>
       <w:r>
         <w:rPr>
           <w:rStyle w:val="fs14fw4"/>
-          <w:sz w:val="22"/>
-          <w:szCs w:val="22"/>
-        </w:rPr>
-        <w:t>Flint, MI</w:t>
+          <w:sz w:val="20"/>
+          <w:szCs w:val="22"/>
+        </w:rPr>
       </w:r>
       <w:bookmarkEnd w:id="7"/>
       <w:r>
         <w:rPr>
           <w:rStyle w:val="fs14fw4"/>
-          <w:sz w:val="22"/>
-          <w:szCs w:val="22"/>
-        </w:rPr>
-        <w:tab/>
+          <w:sz w:val="20"/>
+          <w:szCs w:val="22"/>
+        </w:rPr>
       </w:r>
       <w:bookmarkStart w:id="8" w:name="div_18"/>
       <w:r>
         <w:rPr>
           <w:rStyle w:val="fs14fw4"/>
-          <w:sz w:val="22"/>
-          <w:szCs w:val="22"/>
-        </w:rPr>
-        <w:t>October 2026 - June 2030</w:t>
+          <w:sz w:val="20"/>
+          <w:szCs w:val="22"/>
+        </w:rPr>
       </w:r>
       <w:bookmarkEnd w:id="8"/>
     </w:p>
     <w:p>
       <w:pPr>
-        <w:spacing w:line="220" w:lineRule="atLeast"/>
+        <w:spacing w:line="240" w:lineRule="auto" w:after="0" w:before="0"/>
         <w:rPr>
           <w:sz w:val="22"/>
           <w:szCs w:val="22"/>
@@ -150,7 +140,7 @@
       <w:r>
         <w:rPr>
           <w:rStyle w:val="fs14fw4overflow-hidden"/>
-          <w:sz w:val="22"/>
+          <w:sz w:val="20"/>
           <w:szCs w:val="22"/>
         </w:rPr>
         <w:t>Bachelor of Science</w:t>
@@ -158,14 +148,14 @@
       <w:bookmarkEnd w:id="9"/>
       <w:r>
         <w:rPr>
-          <w:sz w:val="22"/>
+          <w:sz w:val="20"/>
           <w:szCs w:val="22"/>
         </w:rPr>
         <w:t xml:space="preserve"> </w:t>
       </w:r>
       <w:r>
         <w:rPr>
-          <w:sz w:val="22"/>
+          <w:sz w:val="20"/>
           <w:szCs w:val="22"/>
         </w:rPr>
         <w:t>in Mechanical Engineering</w:t>
@@ -177,20 +167,19 @@
           <w:ilvl w:val="0"/>
           <w:numId w:val="1"/>
         </w:numPr>
-        <w:spacing w:line="220" w:lineRule="atLeast"/>
+        <w:spacing w:line="240" w:lineRule="auto" w:after="0" w:before="0"/>
         <w:ind w:hanging="366"/>
         <w:rPr>
           <w:sz w:val="22"/>
           <w:szCs w:val="22"/>
         </w:rPr>
       </w:pPr>
-      <w:bookmarkStart w:id="10" w:name="div_20"/>
-      <w:r>
-        <w:rPr>
-          <w:sz w:val="22"/>
-          <w:szCs w:val="22"/>
-        </w:rPr>
-        <w:t>Freshman</w:t>
+      <w:r>
+        <w:rPr>
+          <w:sz w:val="20"/>
+          <w:szCs w:val="22"/>
+        </w:rPr>
+        <w:t>Freshman | Current coursework: Calculus, Computational Thinking, Chemistry and Lab</w:t>
       </w:r>
     </w:p>
     <w:p>
@@ -199,7 +188,7 @@
           <w:ilvl w:val="0"/>
           <w:numId w:val="1"/>
         </w:numPr>
-        <w:spacing w:line="220" w:lineRule="atLeast"/>
+        <w:spacing w:line="240" w:lineRule="auto" w:after="0" w:before="0"/>
         <w:ind w:hanging="366"/>
         <w:rPr>
           <w:sz w:val="22"/>
@@ -208,124 +197,115 @@
       </w:pPr>
       <w:r>
         <w:rPr>
-          <w:sz w:val="22"/>
-          <w:szCs w:val="22"/>
-        </w:rPr>
-        <w:t>Mechanical engineering co-op availability: April–September 2027 | Willing to relocate</w:t>
-      </w:r>
-    </w:p>
-    <w:p>
-      <w:pPr>
-        <w:spacing w:line="220" w:lineRule="atLeast"/>
-        <w:rPr>
-          <w:sz w:val="22"/>
-          <w:szCs w:val="22"/>
-        </w:rPr>
-      </w:pPr>
-      <w:r>
-        <w:rPr>
-          <w:sz w:val="22"/>
-          <w:szCs w:val="22"/>
-        </w:rPr>
-        <w:t>Troy High School</w:t>
-      </w:r>
-      <w:r>
-        <w:rPr>
-          <w:sz w:val="22"/>
-          <w:szCs w:val="22"/>
-        </w:rPr>
-        <w:t xml:space="preserve">, </w:t>
-      </w:r>
-      <w:r>
-        <w:rPr>
-          <w:sz w:val="22"/>
-          <w:szCs w:val="22"/>
-        </w:rPr>
-        <w:t>Troy</w:t>
-      </w:r>
-      <w:r>
-        <w:rPr>
-          <w:sz w:val="22"/>
-          <w:szCs w:val="22"/>
-        </w:rPr>
-        <w:t xml:space="preserve">, </w:t>
-      </w:r>
-      <w:r>
-        <w:rPr>
-          <w:sz w:val="22"/>
-          <w:szCs w:val="22"/>
-        </w:rPr>
-        <w:t>Michigan</w:t>
-      </w:r>
-      <w:r>
-        <w:rPr>
-          <w:sz w:val="22"/>
-          <w:szCs w:val="22"/>
-        </w:rPr>
+          <w:sz w:val="20"/>
+          <w:szCs w:val="22"/>
+        </w:rPr>
+        <w:t>Co-op availability: April–September 2027 | Willing to relocate throughout the U.S. and travel</w:t>
+      </w:r>
+    </w:p>
+    <w:p>
+      <w:pPr>
+        <w:tabs>
+          <w:tab w:pos="10787" w:val="right"/>
+        </w:tabs>
+        <w:spacing w:line="240" w:lineRule="auto" w:after="0" w:before="0"/>
+        <w:rPr>
+          <w:sz w:val="22"/>
+          <w:szCs w:val="22"/>
+        </w:rPr>
+      </w:pPr>
+      <w:r>
+        <w:rPr>
+          <w:sz w:val="20"/>
+          <w:szCs w:val="22"/>
+        </w:rPr>
+        <w:t>Troy High School, Troy, Michigan</w:t>
         <w:tab/>
-      </w:r>
-      <w:r>
-        <w:rPr>
-          <w:sz w:val="22"/>
-          <w:szCs w:val="22"/>
-        </w:rPr>
-        <w:tab/>
-      </w:r>
-      <w:r>
-        <w:rPr>
-          <w:sz w:val="22"/>
-          <w:szCs w:val="22"/>
-        </w:rPr>
-        <w:tab/>
-      </w:r>
-      <w:r>
-        <w:rPr>
-          <w:sz w:val="22"/>
-          <w:szCs w:val="22"/>
-        </w:rPr>
-        <w:tab/>
-      </w:r>
-      <w:r>
-        <w:rPr>
-          <w:sz w:val="22"/>
-          <w:szCs w:val="22"/>
-        </w:rPr>
-        <w:tab/>
-      </w:r>
-      <w:r>
-        <w:rPr>
-          <w:sz w:val="22"/>
-          <w:szCs w:val="22"/>
-        </w:rPr>
-        <w:tab/>
-      </w:r>
-      <w:r>
-        <w:rPr>
-          <w:sz w:val="22"/>
-          <w:szCs w:val="22"/>
-        </w:rPr>
-        <w:t xml:space="preserve">           </w:t>
-      </w:r>
-      <w:r>
-        <w:rPr>
-          <w:sz w:val="22"/>
-          <w:szCs w:val="22"/>
-        </w:rPr>
-        <w:t xml:space="preserve">         </w:t>
-      </w:r>
-      <w:r>
-        <w:rPr>
-          <w:sz w:val="22"/>
-          <w:szCs w:val="22"/>
-        </w:rPr>
-        <w:t xml:space="preserve">  </w:t>
-      </w:r>
-      <w:r>
-        <w:rPr>
-          <w:sz w:val="22"/>
-          <w:szCs w:val="22"/>
-        </w:rPr>
-        <w:t>August 2023 – May 2026</w:t>
+        <w:t>Aug 2023 – May 2026</w:t>
+      </w:r>
+      <w:r>
+        <w:rPr>
+          <w:sz w:val="20"/>
+          <w:szCs w:val="22"/>
+        </w:rPr>
+      </w:r>
+      <w:r>
+        <w:rPr>
+          <w:sz w:val="20"/>
+          <w:szCs w:val="22"/>
+        </w:rPr>
+      </w:r>
+      <w:r>
+        <w:rPr>
+          <w:sz w:val="20"/>
+          <w:szCs w:val="22"/>
+        </w:rPr>
+      </w:r>
+      <w:r>
+        <w:rPr>
+          <w:sz w:val="20"/>
+          <w:szCs w:val="22"/>
+        </w:rPr>
+      </w:r>
+      <w:r>
+        <w:rPr>
+          <w:sz w:val="20"/>
+          <w:szCs w:val="22"/>
+        </w:rPr>
+      </w:r>
+      <w:r>
+        <w:rPr>
+          <w:sz w:val="20"/>
+          <w:szCs w:val="22"/>
+        </w:rPr>
+      </w:r>
+      <w:r>
+        <w:rPr>
+          <w:sz w:val="20"/>
+          <w:szCs w:val="22"/>
+        </w:rPr>
+      </w:r>
+      <w:r>
+        <w:rPr>
+          <w:sz w:val="20"/>
+          <w:szCs w:val="22"/>
+        </w:rPr>
+      </w:r>
+      <w:r>
+        <w:rPr>
+          <w:sz w:val="20"/>
+          <w:szCs w:val="22"/>
+        </w:rPr>
+      </w:r>
+      <w:r>
+        <w:rPr>
+          <w:sz w:val="20"/>
+          <w:szCs w:val="22"/>
+        </w:rPr>
+      </w:r>
+      <w:r>
+        <w:rPr>
+          <w:sz w:val="20"/>
+          <w:szCs w:val="22"/>
+        </w:rPr>
+      </w:r>
+      <w:r>
+        <w:rPr>
+          <w:sz w:val="20"/>
+          <w:szCs w:val="22"/>
+        </w:rPr>
+      </w:r>
+      <w:r>
+        <w:rPr>
+          <w:sz w:val="20"/>
+          <w:szCs w:val="22"/>
+        </w:rPr>
+      </w:r>
+      <w:r>
+        <w:rPr>
+          <w:sz w:val="20"/>
+          <w:szCs w:val="22"/>
+        </w:rPr>
       </w:r>
     </w:p>
     <w:p>
@@ -335,58 +315,18 @@
           <w:ilvl w:val="0"/>
           <w:numId w:val="1"/>
         </w:numPr>
-        <w:spacing w:line="220" w:lineRule="atLeast"/>
-        <w:rPr>
-          <w:sz w:val="22"/>
-          <w:szCs w:val="22"/>
-        </w:rPr>
-      </w:pPr>
-      <w:r>
-        <w:rPr>
-          <w:sz w:val="22"/>
+        <w:spacing w:line="240" w:lineRule="auto" w:after="0" w:before="0"/>
+        <w:rPr>
+          <w:sz w:val="22"/>
+          <w:szCs w:val="22"/>
+        </w:rPr>
+      </w:pPr>
+      <w:r>
+        <w:rPr>
+          <w:sz w:val="20"/>
           <w:szCs w:val="22"/>
         </w:rPr>
         <w:t>SAT: 1490 (790 Math)</w:t>
-      </w:r>
-      <w:bookmarkEnd w:id="10"/>
-    </w:p>
-    <w:p>
-      <w:pPr>
-        <w:numPr>
-          <w:ilvl w:val="0"/>
-          <w:numId w:val="1"/>
-        </w:numPr>
-        <w:spacing w:line="220" w:lineRule="atLeast"/>
-        <w:ind w:hanging="366"/>
-        <w:rPr>
-          <w:sz w:val="22"/>
-          <w:szCs w:val="22"/>
-        </w:rPr>
-      </w:pPr>
-      <w:bookmarkStart w:id="11" w:name="div_21"/>
-      <w:r>
-        <w:rPr>
-          <w:sz w:val="22"/>
-          <w:szCs w:val="22"/>
-        </w:rPr>
-        <w:t>Relevant coursework: AP Calculus AB, AP Computer Science A, AP Computer Science Principles</w:t>
-      </w:r>
-      <w:bookmarkEnd w:id="11"/>
-    </w:p>
-    <w:p>
-      <w:pPr>
-        <w:spacing w:line="220" w:lineRule="atLeast"/>
-        <w:rPr>
-          <w:sz w:val="22"/>
-          <w:szCs w:val="22"/>
-        </w:rPr>
-      </w:pPr>
-      <w:r>
-        <w:rPr>
-          <w:sz w:val="22"/>
-          <w:szCs w:val="22"/>
-        </w:rPr>
-        <w:t> </w:t>
       </w:r>
     </w:p>
     <w:p>
@@ -394,7 +334,7 @@
         <w:pBdr>
           <w:bottom w:val="single" w:sz="6" w:space="0" w:color="000000"/>
         </w:pBdr>
-        <w:spacing w:line="220" w:lineRule="atLeast"/>
+        <w:spacing w:line="240" w:lineRule="auto" w:after="0" w:before="20"/>
         <w:rPr>
           <w:b/>
           <w:bCs/>
@@ -403,203 +343,13 @@
           <w:szCs w:val="22"/>
         </w:rPr>
       </w:pPr>
-      <w:bookmarkStart w:id="40" w:name="381786091174206"/>
+      <w:bookmarkStart w:id="12" w:name="389182222891180"/>
       <w:r>
         <w:rPr>
           <w:b/>
           <w:bCs/>
           <w:caps/>
-          <w:sz w:val="22"/>
-          <w:szCs w:val="22"/>
-        </w:rPr>
-        <w:t>TECHNICAL SKILLS AND CERTIFICATIONS</w:t>
-      </w:r>
-      <w:bookmarkEnd w:id="40"/>
-      <w:r>
-        <w:rPr>
-          <w:b/>
-          <w:bCs/>
-          <w:caps/>
-          <w:sz w:val="22"/>
-          <w:szCs w:val="22"/>
-        </w:rPr>
-      </w:r>
-    </w:p>
-    <w:p>
-      <w:pPr>
-        <w:numPr>
-          <w:ilvl w:val="0"/>
-          <w:numId w:val="7"/>
-        </w:numPr>
-        <w:spacing w:line="220" w:lineRule="atLeast"/>
-        <w:ind w:hanging="366"/>
-        <w:rPr>
-          <w:sz w:val="22"/>
-          <w:szCs w:val="22"/>
-        </w:rPr>
-      </w:pPr>
-      <w:bookmarkStart w:id="41" w:name="div_85"/>
-      <w:r>
-        <w:rPr>
-          <w:sz w:val="22"/>
-          <w:szCs w:val="22"/>
-        </w:rPr>
-        <w:t>CAD: SolidWorks and AutoCAD (beginner, self-taught)</w:t>
-      </w:r>
-      <w:bookmarkEnd w:id="41"/>
-    </w:p>
-    <w:p>
-      <w:pPr>
-        <w:numPr>
-          <w:ilvl w:val="0"/>
-          <w:numId w:val="7"/>
-        </w:numPr>
-        <w:spacing w:line="220" w:lineRule="atLeast"/>
-        <w:ind w:hanging="366"/>
-        <w:rPr>
-          <w:sz w:val="22"/>
-          <w:szCs w:val="22"/>
-        </w:rPr>
-      </w:pPr>
-      <w:bookmarkStart w:id="42" w:name="div_86"/>
-      <w:r>
-        <w:rPr>
-          <w:sz w:val="22"/>
-          <w:szCs w:val="22"/>
-        </w:rPr>
-        <w:t>Programming and databases: Java, MySQL, Firebase</w:t>
-      </w:r>
-      <w:bookmarkEnd w:id="42"/>
-    </w:p>
-    <w:p>
-      <w:pPr>
-        <w:numPr>
-          <w:ilvl w:val="0"/>
-          <w:numId w:val="7"/>
-        </w:numPr>
-        <w:spacing w:line="220" w:lineRule="atLeast"/>
-        <w:ind w:hanging="366"/>
-        <w:rPr>
-          <w:sz w:val="22"/>
-          <w:szCs w:val="22"/>
-        </w:rPr>
-      </w:pPr>
-      <w:bookmarkStart w:id="43" w:name="div_87"/>
-      <w:r>
-        <w:rPr>
-          <w:sz w:val="22"/>
-          <w:szCs w:val="22"/>
-        </w:rPr>
-        <w:t>Web development: HTML, JavaScript, GitHub, Base44, AI-assisted tools</w:t>
-      </w:r>
-      <w:bookmarkEnd w:id="43"/>
-    </w:p>
-    <w:p>
-      <w:pPr>
-        <w:numPr>
-          <w:ilvl w:val="0"/>
-          <w:numId w:val="7"/>
-        </w:numPr>
-        <w:spacing w:line="220" w:lineRule="atLeast"/>
-        <w:ind w:hanging="366"/>
-        <w:rPr>
-          <w:sz w:val="22"/>
-          <w:szCs w:val="22"/>
-        </w:rPr>
-      </w:pPr>
-      <w:bookmarkStart w:id="44" w:name="div_88"/>
-      <w:r>
-        <w:rPr>
-          <w:sz w:val="22"/>
-          <w:szCs w:val="22"/>
-        </w:rPr>
-        <w:t>Microsoft Office: Excel, PowerPoint, Word</w:t>
-      </w:r>
-      <w:bookmarkEnd w:id="44"/>
-    </w:p>
-    <w:p>
-      <w:pPr>
-        <w:numPr>
-          <w:ilvl w:val="0"/>
-          <w:numId w:val="7"/>
-        </w:numPr>
-        <w:spacing w:line="220" w:lineRule="atLeast"/>
-        <w:ind w:hanging="366"/>
-        <w:rPr>
-          <w:sz w:val="22"/>
-          <w:szCs w:val="22"/>
-        </w:rPr>
-      </w:pPr>
-      <w:bookmarkStart w:id="45" w:name="div_89"/>
-      <w:r>
-        <w:rPr>
-          <w:sz w:val="22"/>
-          <w:szCs w:val="22"/>
-        </w:rPr>
-        <w:t>Languages: English and Tamil (Biliteracy Certified)</w:t>
-      </w:r>
-      <w:bookmarkEnd w:id="45"/>
-    </w:p>
-    <w:p>
-      <w:pPr>
-        <w:numPr>
-          <w:ilvl w:val="0"/>
-          <w:numId w:val="7"/>
-        </w:numPr>
-        <w:spacing w:line="220" w:lineRule="atLeast"/>
-        <w:ind w:hanging="366"/>
-        <w:rPr>
-          <w:sz w:val="22"/>
-          <w:szCs w:val="22"/>
-        </w:rPr>
-      </w:pPr>
-      <w:bookmarkStart w:id="46" w:name="div_90"/>
-      <w:r>
-        <w:rPr>
-          <w:sz w:val="22"/>
-          <w:szCs w:val="22"/>
-        </w:rPr>
-        <w:t>Certifications: CPR and First Aid</w:t>
-      </w:r>
-      <w:bookmarkEnd w:id="46"/>
-    </w:p>
-    <w:p>
-      <w:pPr>
-        <w:spacing w:line="220" w:lineRule="atLeast"/>
-        <w:rPr>
-          <w:sz w:val="22"/>
-          <w:szCs w:val="22"/>
-        </w:rPr>
-      </w:pPr>
-      <w:r>
-        <w:rPr>
-          <w:sz w:val="22"/>
-          <w:szCs w:val="22"/>
-        </w:rPr>
-        <w:t>  </w:t>
-      </w:r>
-    </w:p>
-    <w:p>
-      <w:pPr>
-        <w:pBdr>
-          <w:bottom w:val="single" w:sz="6" w:space="0" w:color="000000"/>
-        </w:pBdr>
-        <w:spacing w:line="220" w:lineRule="atLeast"/>
-        <w:rPr>
-          <w:b/>
-          <w:bCs/>
-          <w:caps/>
-          <w:sz w:val="22"/>
-          <w:szCs w:val="22"/>
-        </w:rPr>
-      </w:pPr>
-      <w:bookmarkStart w:id="12" w:name="389182222891180"/>
-      <w:r>
-        <w:rPr>
-          <w:b/>
-          <w:bCs/>
-          <w:caps/>
-          <w:sz w:val="22"/>
+          <w:sz w:val="20"/>
           <w:szCs w:val="22"/>
         </w:rPr>
         <w:t>TECHNICAL EXPERIENCE</w:t>
@@ -609,9 +359,9 @@
     <w:p>
       <w:pPr>
         <w:tabs>
-          <w:tab w:val="right" w:pos="10800"/>
-        </w:tabs>
-        <w:spacing w:line="220" w:lineRule="atLeast"/>
+          <w:tab w:pos="10787" w:val="right"/>
+        </w:tabs>
+        <w:spacing w:line="240" w:lineRule="auto" w:after="0" w:before="0"/>
         <w:rPr>
           <w:sz w:val="22"/>
           <w:szCs w:val="22"/>
@@ -621,52 +371,50 @@
       <w:r>
         <w:rPr>
           <w:rStyle w:val="fs14fw4"/>
-          <w:sz w:val="22"/>
-          <w:szCs w:val="22"/>
-        </w:rPr>
-        <w:t>WEB-C</w:t>
+          <w:sz w:val="20"/>
+          <w:szCs w:val="22"/>
+        </w:rPr>
+        <w:t>WEB-C, Troy, MI</w:t>
+        <w:tab/>
+        <w:t>Jan 2026 – Jun 2026</w:t>
       </w:r>
       <w:bookmarkEnd w:id="13"/>
       <w:r>
         <w:rPr>
           <w:rStyle w:val="fs14fw4undefinedtdn"/>
-          <w:sz w:val="22"/>
-          <w:szCs w:val="22"/>
-        </w:rPr>
-        <w:t xml:space="preserve">, </w:t>
+          <w:sz w:val="20"/>
+          <w:szCs w:val="22"/>
+        </w:rPr>
       </w:r>
       <w:bookmarkStart w:id="14" w:name="div_25"/>
       <w:r>
         <w:rPr>
           <w:rStyle w:val="fs14fw4"/>
-          <w:sz w:val="22"/>
-          <w:szCs w:val="22"/>
-        </w:rPr>
-        <w:t>Troy, MI</w:t>
+          <w:sz w:val="20"/>
+          <w:szCs w:val="22"/>
+        </w:rPr>
       </w:r>
       <w:bookmarkEnd w:id="14"/>
       <w:r>
         <w:rPr>
           <w:rStyle w:val="fs14fw4"/>
-          <w:sz w:val="22"/>
-          <w:szCs w:val="22"/>
-        </w:rPr>
-        <w:tab/>
+          <w:sz w:val="20"/>
+          <w:szCs w:val="22"/>
+        </w:rPr>
       </w:r>
       <w:bookmarkStart w:id="15" w:name="div_31"/>
       <w:r>
         <w:rPr>
           <w:rStyle w:val="fs14fw4"/>
-          <w:sz w:val="22"/>
-          <w:szCs w:val="22"/>
-        </w:rPr>
-        <w:t>January 2026 - June 2026</w:t>
+          <w:sz w:val="20"/>
+          <w:szCs w:val="22"/>
+        </w:rPr>
       </w:r>
       <w:bookmarkEnd w:id="15"/>
     </w:p>
     <w:p>
       <w:pPr>
-        <w:spacing w:line="220" w:lineRule="atLeast"/>
+        <w:spacing w:line="240" w:lineRule="auto" w:after="0" w:before="0"/>
         <w:rPr>
           <w:sz w:val="22"/>
           <w:szCs w:val="22"/>
@@ -678,7 +426,7 @@
           <w:rStyle w:val="fs14fw4fsioverflow-hidden"/>
           <w:i/>
           <w:iCs/>
-          <w:sz w:val="22"/>
+          <w:sz w:val="20"/>
           <w:szCs w:val="22"/>
         </w:rPr>
         <w:t>Founder &amp; Web Developer</w:t>
@@ -686,7 +434,7 @@
       <w:bookmarkEnd w:id="16"/>
       <w:r>
         <w:rPr>
-          <w:sz w:val="22"/>
+          <w:sz w:val="20"/>
           <w:szCs w:val="22"/>
         </w:rPr>
         <w:t xml:space="preserve"> </w:t>
@@ -698,22 +446,20 @@
           <w:ilvl w:val="0"/>
           <w:numId w:val="2"/>
         </w:numPr>
-        <w:spacing w:line="220" w:lineRule="atLeast"/>
+        <w:spacing w:line="240" w:lineRule="auto" w:after="0" w:before="0"/>
         <w:ind w:hanging="366"/>
         <w:rPr>
           <w:sz w:val="22"/>
           <w:szCs w:val="22"/>
         </w:rPr>
       </w:pPr>
-      <w:bookmarkStart w:id="17" w:name="div_32"/>
-      <w:r>
-        <w:rPr>
-          <w:sz w:val="22"/>
-          <w:szCs w:val="22"/>
-        </w:rPr>
-        <w:t>Published 17 websites for local businesses after reaching 50+ prospects through outreach and personalized demonstrations.</w:t>
-      </w:r>
-      <w:bookmarkEnd w:id="17"/>
+      <w:r>
+        <w:rPr>
+          <w:sz w:val="20"/>
+          <w:szCs w:val="22"/>
+        </w:rPr>
+        <w:t>Deployed 17 custom websites through 2 stages: discovery and prototyping, then client review, refinement, and launch.</w:t>
+      </w:r>
     </w:p>
     <w:p>
       <w:pPr>
@@ -721,22 +467,20 @@
           <w:ilvl w:val="0"/>
           <w:numId w:val="2"/>
         </w:numPr>
-        <w:spacing w:line="220" w:lineRule="atLeast"/>
+        <w:spacing w:line="240" w:lineRule="auto" w:after="0" w:before="0"/>
         <w:ind w:hanging="366"/>
         <w:rPr>
           <w:sz w:val="22"/>
           <w:szCs w:val="22"/>
         </w:rPr>
       </w:pPr>
-      <w:bookmarkStart w:id="18" w:name="div_33"/>
-      <w:r>
-        <w:rPr>
-          <w:sz w:val="22"/>
-          <w:szCs w:val="22"/>
-        </w:rPr>
-        <w:t>Built custom websites using HTML, JavaScript, GitHub, Base44, and AI-assisted tools to meet client requirements.</w:t>
-      </w:r>
-      <w:bookmarkEnd w:id="18"/>
+      <w:r>
+        <w:rPr>
+          <w:sz w:val="20"/>
+          <w:szCs w:val="22"/>
+        </w:rPr>
+        <w:t>Engaged 50+ prospects; designed responsive interfaces, automated booking workflows, and multi-step inquiry forms.</w:t>
+      </w:r>
     </w:p>
     <w:p>
       <w:pPr>
@@ -744,37 +488,40 @@
           <w:ilvl w:val="0"/>
           <w:numId w:val="2"/>
         </w:numPr>
-        <w:spacing w:line="220" w:lineRule="atLeast"/>
+        <w:spacing w:line="240" w:lineRule="auto" w:after="0" w:before="0"/>
         <w:ind w:hanging="366"/>
         <w:rPr>
           <w:sz w:val="22"/>
           <w:szCs w:val="22"/>
         </w:rPr>
       </w:pPr>
-      <w:bookmarkStart w:id="19" w:name="div_34"/>
-      <w:r>
-        <w:rPr>
-          <w:sz w:val="22"/>
-          <w:szCs w:val="22"/>
-        </w:rPr>
-        <w:t>Gathered client feedback, tested sites across devices, and integrated forms, maps, and social media through deployment.</w:t>
-      </w:r>
-      <w:bookmarkEnd w:id="19"/>
-    </w:p>
-    <w:p>
-      <w:pPr>
-        <w:spacing w:line="220" w:lineRule="atLeast"/>
-        <w:rPr>
-          <w:sz w:val="22"/>
-          <w:szCs w:val="22"/>
-        </w:rPr>
-      </w:pPr>
-      <w:r>
-        <w:rPr>
-          <w:sz w:val="22"/>
-          <w:szCs w:val="22"/>
-        </w:rPr>
-        <w:t> </w:t>
+      <w:r>
+        <w:rPr>
+          <w:sz w:val="20"/>
+          <w:szCs w:val="22"/>
+        </w:rPr>
+        <w:t>Built with HTML, JavaScript, GitHub, and AI-assisted tools; tested across devices and incorporated client feedback.</w:t>
+      </w:r>
+    </w:p>
+    <w:p>
+      <w:pPr>
+        <w:numPr>
+          <w:ilvl w:val="0"/>
+          <w:numId w:val="2"/>
+        </w:numPr>
+        <w:spacing w:line="240" w:lineRule="auto" w:after="0" w:before="0"/>
+        <w:ind w:hanging="366"/>
+        <w:rPr>
+          <w:sz w:val="22"/>
+          <w:szCs w:val="22"/>
+        </w:rPr>
+      </w:pPr>
+      <w:r>
+        <w:rPr>
+          <w:sz w:val="20"/>
+          <w:szCs w:val="22"/>
+        </w:rPr>
+        <w:t>Conducted 3-month follow-ups with 3 business owners, who reported fewer scheduling calls, less administrative work, and more time for operations; praised responsive support and ease of use.</w:t>
       </w:r>
     </w:p>
     <w:p>
@@ -782,7 +529,7 @@
         <w:pBdr>
           <w:bottom w:val="single" w:sz="6" w:space="0" w:color="000000"/>
         </w:pBdr>
-        <w:spacing w:line="220" w:lineRule="atLeast"/>
+        <w:spacing w:line="240" w:lineRule="auto" w:after="0" w:before="20"/>
         <w:rPr>
           <w:b/>
           <w:bCs/>
@@ -797,209 +544,12 @@
           <w:b/>
           <w:bCs/>
           <w:caps/>
-          <w:sz w:val="22"/>
+          <w:sz w:val="20"/>
           <w:szCs w:val="22"/>
         </w:rPr>
         <w:t>HONORS AND AWARDS</w:t>
       </w:r>
       <w:bookmarkEnd w:id="20"/>
-    </w:p>
-    <w:p>
-      <w:pPr>
-        <w:tabs>
-          <w:tab w:val="right" w:pos="10800"/>
-        </w:tabs>
-        <w:spacing w:line="220" w:lineRule="atLeast"/>
-        <w:rPr>
-          <w:sz w:val="22"/>
-          <w:szCs w:val="22"/>
-        </w:rPr>
-      </w:pPr>
-      <w:bookmarkStart w:id="21" w:name="div_43"/>
-      <w:r>
-        <w:rPr>
-          <w:rStyle w:val="fs14fw4"/>
-          <w:sz w:val="22"/>
-          <w:szCs w:val="22"/>
-        </w:rPr>
-        <w:t>Michigan High School Cricket Tournament</w:t>
-      </w:r>
-      <w:bookmarkEnd w:id="21"/>
-      <w:r>
-        <w:rPr>
-          <w:rStyle w:val="fs14fw4undefinedtdn"/>
-          <w:sz w:val="22"/>
-          <w:szCs w:val="22"/>
-        </w:rPr>
-        <w:t xml:space="preserve">, </w:t>
-      </w:r>
-      <w:bookmarkStart w:id="22" w:name="div_40"/>
-      <w:r>
-        <w:rPr>
-          <w:rStyle w:val="fs14fw4"/>
-          <w:sz w:val="22"/>
-          <w:szCs w:val="22"/>
-        </w:rPr>
-        <w:t>Novi, MI</w:t>
-      </w:r>
-      <w:bookmarkEnd w:id="22"/>
-      <w:r>
-        <w:rPr>
-          <w:rStyle w:val="fs14fw4"/>
-          <w:sz w:val="22"/>
-          <w:szCs w:val="22"/>
-        </w:rPr>
-        <w:tab/>
-      </w:r>
-      <w:bookmarkStart w:id="23" w:name="div_39"/>
-      <w:r>
-        <w:rPr>
-          <w:rStyle w:val="fs14fw4"/>
-          <w:sz w:val="22"/>
-          <w:szCs w:val="22"/>
-        </w:rPr>
-        <w:t>January 2026 - December 2026</w:t>
-      </w:r>
-      <w:bookmarkEnd w:id="23"/>
-    </w:p>
-    <w:p>
-      <w:pPr>
-        <w:spacing w:line="220" w:lineRule="atLeast"/>
-        <w:rPr>
-          <w:sz w:val="22"/>
-          <w:szCs w:val="22"/>
-        </w:rPr>
-      </w:pPr>
-      <w:bookmarkStart w:id="24" w:name="div_44"/>
-      <w:r>
-        <w:rPr>
-          <w:rStyle w:val="fs14fw4fsioverflow-hidden"/>
-          <w:i/>
-          <w:iCs/>
-          <w:sz w:val="22"/>
-          <w:szCs w:val="22"/>
-        </w:rPr>
-        <w:t>Michigan High School Cricket Association Best Bowler of the Year</w:t>
-      </w:r>
-      <w:bookmarkEnd w:id="24"/>
-      <w:r>
-        <w:rPr>
-          <w:sz w:val="22"/>
-          <w:szCs w:val="22"/>
-        </w:rPr>
-        <w:t xml:space="preserve"> </w:t>
-      </w:r>
-    </w:p>
-    <w:p>
-      <w:pPr>
-        <w:numPr>
-          <w:ilvl w:val="0"/>
-          <w:numId w:val="3"/>
-        </w:numPr>
-        <w:spacing w:line="220" w:lineRule="atLeast"/>
-        <w:ind w:hanging="366"/>
-        <w:rPr>
-          <w:sz w:val="22"/>
-          <w:szCs w:val="22"/>
-        </w:rPr>
-      </w:pPr>
-      <w:bookmarkStart w:id="25" w:name="div_42"/>
-      <w:r>
-        <w:rPr>
-          <w:sz w:val="22"/>
-          <w:szCs w:val="22"/>
-        </w:rPr>
-        <w:t>Led Troy High School to the 2026 Michigan High School State Championship</w:t>
-      </w:r>
-      <w:bookmarkEnd w:id="25"/>
-    </w:p>
-    <w:p>
-      <w:pPr>
-        <w:spacing w:line="220" w:lineRule="atLeast"/>
-        <w:rPr>
-          <w:sz w:val="22"/>
-          <w:szCs w:val="22"/>
-        </w:rPr>
-      </w:pPr>
-      <w:r>
-        <w:rPr>
-          <w:sz w:val="22"/>
-          <w:szCs w:val="22"/>
-        </w:rPr>
-        <w:t> </w:t>
-      </w:r>
-    </w:p>
-    <w:p>
-      <w:pPr>
-        <w:pBdr>
-          <w:bottom w:val="single" w:sz="6" w:space="0" w:color="000000"/>
-        </w:pBdr>
-        <w:spacing w:line="220" w:lineRule="atLeast"/>
-        <w:rPr>
-          <w:b/>
-          <w:bCs/>
-          <w:caps/>
-          <w:sz w:val="22"/>
-          <w:szCs w:val="22"/>
-        </w:rPr>
-      </w:pPr>
-      <w:r>
-        <w:rPr>
-          <w:b/>
-          <w:bCs/>
-          <w:caps/>
-          <w:sz w:val="22"/>
-          <w:szCs w:val="22"/>
-        </w:rPr>
-        <w:t>VOLUNTEER EXPERIENCE</w:t>
-      </w:r>
-    </w:p>
-    <w:p>
-      <w:pPr>
-        <w:tabs>
-          <w:tab w:val="right" w:pos="10800"/>
-        </w:tabs>
-        <w:spacing w:line="220" w:lineRule="atLeast"/>
-        <w:rPr>
-          <w:sz w:val="22"/>
-          <w:szCs w:val="22"/>
-        </w:rPr>
-      </w:pPr>
-      <w:bookmarkStart w:id="26" w:name="div_62"/>
-      <w:r>
-        <w:rPr>
-          <w:sz w:val="22"/>
-          <w:szCs w:val="22"/>
-        </w:rPr>
-        <w:t>Troy High School Rotary Club, Troy, MI</w:t>
-      </w:r>
-      <w:bookmarkEnd w:id="26"/>
-      <w:r>
-        <w:rPr>
-          <w:sz w:val="22"/>
-          <w:szCs w:val="22"/>
-        </w:rPr>
-        <w:tab/>
-        <w:t>January 2025 - March 2026</w:t>
-      </w:r>
-    </w:p>
-    <w:p>
-      <w:pPr>
-        <w:spacing w:line="220" w:lineRule="atLeast"/>
-        <w:rPr>
-          <w:sz w:val="22"/>
-          <w:szCs w:val="22"/>
-        </w:rPr>
-      </w:pPr>
-      <w:bookmarkStart w:id="27" w:name="div_64"/>
-      <w:r>
-        <w:rPr>
-          <w:sz w:val="22"/>
-          <w:szCs w:val="22"/>
-        </w:rPr>
-        <w:t>Marketer</w:t>
-      </w:r>
-      <w:bookmarkEnd w:id="27"/>
     </w:p>
     <w:p>
       <w:pPr>
@@ -1008,21 +558,19 @@
           <w:ilvl w:val="0"/>
           <w:numId w:val="8"/>
         </w:numPr>
-        <w:spacing w:line="220" w:lineRule="atLeast"/>
-        <w:rPr>
-          <w:sz w:val="22"/>
-          <w:szCs w:val="22"/>
-        </w:rPr>
-      </w:pPr>
-      <w:bookmarkStart w:id="28" w:name="div_65"/>
-      <w:r>
-        <w:rPr>
-          <w:sz w:val="22"/>
-          <w:szCs w:val="22"/>
-        </w:rPr>
-        <w:t>Planned and promoted fundraising events, including shoe drives, cookie sales, badminton tournaments, and restaurant nights.</w:t>
-      </w:r>
-      <w:bookmarkEnd w:id="28"/>
+        <w:spacing w:line="240" w:lineRule="auto" w:after="0" w:before="0"/>
+        <w:rPr>
+          <w:sz w:val="22"/>
+          <w:szCs w:val="22"/>
+        </w:rPr>
+      </w:pPr>
+      <w:r>
+        <w:rPr>
+          <w:sz w:val="20"/>
+          <w:szCs w:val="22"/>
+        </w:rPr>
+        <w:t>National Merit Semifinalist — NMSC, September 2025; recognition held by fewer than 1% of U.S. high-school seniors.</w:t>
+      </w:r>
     </w:p>
     <w:p>
       <w:pPr>
@@ -1031,68 +579,191 @@
           <w:ilvl w:val="0"/>
           <w:numId w:val="8"/>
         </w:numPr>
-        <w:spacing w:line="220" w:lineRule="atLeast"/>
-        <w:rPr>
-          <w:sz w:val="22"/>
-          <w:szCs w:val="22"/>
-        </w:rPr>
-      </w:pPr>
-      <w:bookmarkStart w:id="29" w:name="div_66"/>
-      <w:r>
-        <w:rPr>
-          <w:sz w:val="22"/>
-          <w:szCs w:val="22"/>
-        </w:rPr>
-        <w:t>Raised approximately $1,000–$2,000 within a team that raised over $10,000 for a Ghana education project serving 300+ students; designed outreach materials.</w:t>
-      </w:r>
-      <w:bookmarkEnd w:id="29"/>
-    </w:p>
-    <w:p>
-      <w:pPr>
-        <w:tabs>
-          <w:tab w:val="right" w:pos="10800"/>
-        </w:tabs>
-        <w:spacing w:line="220" w:lineRule="atLeast"/>
-        <w:rPr>
-          <w:sz w:val="22"/>
-          <w:szCs w:val="22"/>
-        </w:rPr>
-      </w:pPr>
-      <w:bookmarkStart w:id="30" w:name="div_68"/>
-      <w:r>
-        <w:rPr>
-          <w:sz w:val="22"/>
-          <w:szCs w:val="22"/>
-        </w:rPr>
-        <w:t>Cricket Umpire, Michigan</w:t>
-      </w:r>
-      <w:bookmarkEnd w:id="30"/>
-      <w:r>
-        <w:rPr>
-          <w:sz w:val="22"/>
-          <w:szCs w:val="22"/>
-        </w:rPr>
+        <w:spacing w:line="240" w:lineRule="auto" w:after="0" w:before="0"/>
+        <w:rPr>
+          <w:sz w:val="22"/>
+          <w:szCs w:val="22"/>
+        </w:rPr>
+      </w:pPr>
+      <w:r>
+        <w:rPr>
+          <w:sz w:val="20"/>
+          <w:szCs w:val="22"/>
+        </w:rPr>
+        <w:t>AP Scholar with Distinction — College Board, August 2026.</w:t>
+      </w:r>
+    </w:p>
+    <w:p>
+      <w:pPr>
+        <w:pStyle w:val="ListParagraph"/>
+        <w:numPr>
+          <w:ilvl w:val="0"/>
+          <w:numId w:val="8"/>
+        </w:numPr>
+        <w:spacing w:line="240" w:lineRule="auto" w:after="0" w:before="0"/>
+        <w:rPr>
+          <w:sz w:val="22"/>
+          <w:szCs w:val="22"/>
+        </w:rPr>
+      </w:pPr>
+      <w:r>
+        <w:rPr>
+          <w:sz w:val="20"/>
+          <w:szCs w:val="22"/>
+        </w:rPr>
+        <w:t>Youth Ideathon 2022 — Top 25 nationally, Team SWIPE, saltwater-engine concept | Jul–Oct 2022</w:t>
+      </w:r>
+    </w:p>
+    <w:p>
+      <w:pPr>
+        <w:pStyle w:val="ListParagraph"/>
+        <w:numPr>
+          <w:ilvl w:val="0"/>
+          <w:numId w:val="8"/>
+        </w:numPr>
+        <w:spacing w:line="240" w:lineRule="auto" w:after="0" w:before="0"/>
+        <w:rPr>
+          <w:sz w:val="22"/>
+          <w:szCs w:val="22"/>
+        </w:rPr>
+      </w:pPr>
+      <w:r>
+        <w:rPr>
+          <w:sz w:val="20"/>
+          <w:szCs w:val="22"/>
+        </w:rPr>
+        <w:t>Tamil Nadu U-14 State Cricket Team | Dec 2022–Jun 2023 — Selected to represent Tamil Nadu on the TNCA youth squad.</w:t>
+      </w:r>
+    </w:p>
+    <w:p>
+      <w:pPr>
+        <w:pStyle w:val="ListParagraph"/>
+        <w:numPr>
+          <w:ilvl w:val="0"/>
+          <w:numId w:val="8"/>
+        </w:numPr>
+        <w:spacing w:line="240" w:lineRule="auto" w:after="0" w:before="0"/>
+        <w:rPr>
+          <w:sz w:val="22"/>
+          <w:szCs w:val="22"/>
+        </w:rPr>
+      </w:pPr>
+      <w:r>
+        <w:rPr>
+          <w:sz w:val="20"/>
+          <w:szCs w:val="22"/>
+        </w:rPr>
+        <w:t>MHSCA (Michigan High School Cricket Association) — Best Bowler of the Year; helped Troy win the 2026 MHSCA Cup.</w:t>
+      </w:r>
+    </w:p>
+    <w:p>
+      <w:pPr>
+        <w:pBdr>
+          <w:bottom w:val="single" w:sz="6" w:space="0" w:color="000000"/>
+        </w:pBdr>
+        <w:spacing w:line="240" w:lineRule="auto" w:after="0" w:before="20"/>
+        <w:rPr>
+          <w:b/>
+          <w:bCs/>
+          <w:caps/>
+          <w:sz w:val="22"/>
+          <w:szCs w:val="22"/>
+        </w:rPr>
+      </w:pPr>
+      <w:r>
+        <w:rPr>
+          <w:b/>
+          <w:bCs/>
+          <w:caps/>
+          <w:sz w:val="20"/>
+          <w:szCs w:val="22"/>
+        </w:rPr>
+        <w:t>VOLUNTEER EXPERIENCE</w:t>
+      </w:r>
+    </w:p>
+    <w:p>
+      <w:pPr>
+        <w:tabs>
+          <w:tab w:pos="10787" w:val="right"/>
+        </w:tabs>
+        <w:spacing w:line="240" w:lineRule="auto" w:after="0" w:before="0"/>
+        <w:rPr>
+          <w:sz w:val="22"/>
+          <w:szCs w:val="22"/>
+        </w:rPr>
+      </w:pPr>
+      <w:r>
+        <w:rPr>
+          <w:sz w:val="20"/>
+          <w:szCs w:val="22"/>
+        </w:rPr>
+        <w:t>Troy High School Rotary Interact Club, Troy, MI | Marketer</w:t>
         <w:tab/>
-        <w:t>June 2025 - August 2026</w:t>
-      </w:r>
-    </w:p>
-    <w:p>
-      <w:pPr>
-        <w:spacing w:line="220" w:lineRule="atLeast"/>
-        <w:rPr>
-          <w:sz w:val="22"/>
-          <w:szCs w:val="22"/>
-        </w:rPr>
-      </w:pPr>
-      <w:bookmarkStart w:id="31" w:name="div_70"/>
-      <w:r>
-        <w:rPr>
-          <w:sz w:val="22"/>
-          <w:szCs w:val="22"/>
-        </w:rPr>
-        <w:t>Volunteer</w:t>
-      </w:r>
-      <w:bookmarkEnd w:id="31"/>
+        <w:t>Dec 2024 – May 2025</w:t>
+      </w:r>
+    </w:p>
+    <w:p>
+      <w:pPr>
+        <w:pStyle w:val="ListParagraph"/>
+        <w:numPr>
+          <w:ilvl w:val="0"/>
+          <w:numId w:val="8"/>
+        </w:numPr>
+        <w:spacing w:line="240" w:lineRule="auto" w:after="0" w:before="0"/>
+        <w:rPr>
+          <w:sz w:val="22"/>
+          <w:szCs w:val="22"/>
+        </w:rPr>
+      </w:pPr>
+      <w:r>
+        <w:rPr>
+          <w:sz w:val="20"/>
+          <w:szCs w:val="22"/>
+        </w:rPr>
+        <w:t>Raised approximately $1,000–$2,000 within a team raising $10,000+ for a Ghana project serving 300+ students.</w:t>
+      </w:r>
+    </w:p>
+    <w:p>
+      <w:pPr>
+        <w:pStyle w:val="ListParagraph"/>
+        <w:numPr>
+          <w:ilvl w:val="0"/>
+          <w:numId w:val="8"/>
+        </w:numPr>
+        <w:spacing w:line="240" w:lineRule="auto" w:after="0" w:before="0"/>
+        <w:rPr>
+          <w:sz w:val="22"/>
+          <w:szCs w:val="22"/>
+        </w:rPr>
+      </w:pPr>
+      <w:r>
+        <w:rPr>
+          <w:sz w:val="20"/>
+          <w:szCs w:val="22"/>
+        </w:rPr>
+        <w:t>Promoted service fundraisers; participated in Rotary Youth Leadership Awards (RYLA).</w:t>
+      </w:r>
+    </w:p>
+    <w:p>
+      <w:pPr>
+        <w:tabs>
+          <w:tab w:pos="10787" w:val="right"/>
+        </w:tabs>
+        <w:spacing w:line="240" w:lineRule="auto" w:after="0" w:before="0"/>
+        <w:rPr>
+          <w:sz w:val="22"/>
+          <w:szCs w:val="22"/>
+        </w:rPr>
+      </w:pPr>
+      <w:r>
+        <w:rPr>
+          <w:sz w:val="20"/>
+          <w:szCs w:val="22"/>
+        </w:rPr>
+        <w:t>National Honor Society, Troy High School | Volunteer</w:t>
+        <w:tab/>
+        <w:t>Sep 2023 – May 2025</w:t>
+      </w:r>
     </w:p>
     <w:p>
       <w:pPr>
@@ -1101,36 +772,102 @@
           <w:ilvl w:val="0"/>
           <w:numId w:val="9"/>
         </w:numPr>
-        <w:spacing w:line="220" w:lineRule="atLeast"/>
-        <w:rPr>
-          <w:sz w:val="22"/>
-          <w:szCs w:val="22"/>
-        </w:rPr>
-      </w:pPr>
-      <w:bookmarkStart w:id="32" w:name="div_71"/>
-      <w:r>
-        <w:rPr>
-          <w:sz w:val="22"/>
-          <w:szCs w:val="22"/>
-        </w:rPr>
-        <w:t>Umpired 30+ competitive cricket matches, applying rules consistently and communicating decisions to players and coaches.</w:t>
-      </w:r>
-      <w:bookmarkEnd w:id="32"/>
-    </w:p>
-    <w:p>
-      <w:pPr>
-        <w:spacing w:line="220" w:lineRule="atLeast"/>
-        <w:rPr>
-          <w:sz w:val="22"/>
-          <w:szCs w:val="22"/>
-        </w:rPr>
-      </w:pPr>
-      <w:r>
-        <w:rPr>
-          <w:sz w:val="22"/>
-          <w:szCs w:val="22"/>
-        </w:rPr>
-        <w:t> </w:t>
+        <w:spacing w:line="240" w:lineRule="auto" w:after="0" w:before="0"/>
+        <w:rPr>
+          <w:sz w:val="22"/>
+          <w:szCs w:val="22"/>
+        </w:rPr>
+      </w:pPr>
+      <w:r>
+        <w:rPr>
+          <w:sz w:val="20"/>
+          <w:szCs w:val="22"/>
+        </w:rPr>
+        <w:t>Contributed 50+ service hours; collaborated with faculty and event coordinators on setup, ticketing, and attendee support.</w:t>
+      </w:r>
+    </w:p>
+    <w:p>
+      <w:pPr>
+        <w:tabs>
+          <w:tab w:pos="10787" w:val="right"/>
+        </w:tabs>
+        <w:spacing w:line="240" w:lineRule="auto" w:after="0" w:before="0"/>
+        <w:rPr>
+          <w:sz w:val="22"/>
+          <w:szCs w:val="22"/>
+        </w:rPr>
+      </w:pPr>
+      <w:r>
+        <w:rPr>
+          <w:sz w:val="20"/>
+          <w:szCs w:val="22"/>
+        </w:rPr>
+        <w:t>Somerset Volleyball | Volunteer Coach and Mentor</w:t>
+        <w:tab/>
+        <w:t>Jun 2025 – Present</w:t>
+      </w:r>
+    </w:p>
+    <w:p>
+      <w:pPr>
+        <w:pStyle w:val="ListParagraph"/>
+        <w:numPr>
+          <w:ilvl w:val="0"/>
+          <w:numId w:val="9"/>
+        </w:numPr>
+        <w:spacing w:line="240" w:lineRule="auto" w:after="0" w:before="0"/>
+        <w:rPr>
+          <w:sz w:val="22"/>
+          <w:szCs w:val="22"/>
+        </w:rPr>
+      </w:pPr>
+      <w:r>
+        <w:rPr>
+          <w:sz w:val="20"/>
+          <w:szCs w:val="22"/>
+        </w:rPr>
+        <w:t>Dedicated 100+ volunteer hours to coaching and mentoring youth alongside 3 volunteers; taught volleyball fundamentals and reinforced teamwork, communication, and confidence through practice.</w:t>
+      </w:r>
+    </w:p>
+    <w:p>
+      <w:pPr>
+        <w:tabs>
+          <w:tab w:pos="10787" w:val="right"/>
+        </w:tabs>
+        <w:spacing w:line="240" w:lineRule="auto" w:after="0" w:before="0"/>
+        <w:rPr>
+          <w:sz w:val="22"/>
+          <w:szCs w:val="22"/>
+        </w:rPr>
+      </w:pPr>
+      <w:r>
+        <w:rPr>
+          <w:sz w:val="20"/>
+          <w:szCs w:val="22"/>
+        </w:rPr>
+        <w:t>Somerset Academic Enrichment Camp | Volunteer Organizer and Peer Tutor</w:t>
+        <w:tab/>
+        <w:t>Jun 2026 – Aug 2026</w:t>
+      </w:r>
+    </w:p>
+    <w:p>
+      <w:pPr>
+        <w:pStyle w:val="ListParagraph"/>
+        <w:numPr>
+          <w:ilvl w:val="0"/>
+          <w:numId w:val="9"/>
+        </w:numPr>
+        <w:spacing w:line="240" w:lineRule="auto" w:after="0" w:before="0"/>
+        <w:rPr>
+          <w:sz w:val="22"/>
+          <w:szCs w:val="22"/>
+        </w:rPr>
+      </w:pPr>
+      <w:r>
+        <w:rPr>
+          <w:sz w:val="20"/>
+          <w:szCs w:val="22"/>
+        </w:rPr>
+        <w:t>Contributed 30 hours to a free, 30-day camp with 2 fellow organizers; tutored students in mathematics and SAT preparation, explaining concepts and guiding practice to strengthen problem-solving skills.</w:t>
       </w:r>
     </w:p>
     <w:p>
@@ -1138,7 +875,7 @@
         <w:pBdr>
           <w:bottom w:val="single" w:sz="6" w:space="0" w:color="000000"/>
         </w:pBdr>
-        <w:spacing w:line="220" w:lineRule="atLeast"/>
+        <w:spacing w:line="240" w:lineRule="auto" w:after="0" w:before="20"/>
         <w:rPr>
           <w:b/>
           <w:bCs/>
@@ -1153,97 +890,35 @@
           <w:b/>
           <w:bCs/>
           <w:caps/>
-          <w:sz w:val="22"/>
-          <w:szCs w:val="22"/>
-        </w:rPr>
-        <w:t>LEADERSHIP</w:t>
+          <w:sz w:val="20"/>
+          <w:szCs w:val="22"/>
+        </w:rPr>
+        <w:t>LEADERSHIP AND ACTIVITIES</w:t>
       </w:r>
       <w:bookmarkEnd w:id="33"/>
     </w:p>
     <w:p>
       <w:pPr>
         <w:tabs>
-          <w:tab w:val="right" w:pos="10800"/>
-        </w:tabs>
-        <w:spacing w:line="220" w:lineRule="atLeast"/>
-        <w:rPr>
-          <w:sz w:val="22"/>
-          <w:szCs w:val="22"/>
-        </w:rPr>
-      </w:pPr>
-      <w:bookmarkStart w:id="34" w:name="div_74"/>
+          <w:tab w:pos="10787" w:val="right"/>
+        </w:tabs>
+        <w:spacing w:line="240" w:lineRule="auto" w:after="0" w:before="0"/>
+        <w:rPr>
+          <w:sz w:val="22"/>
+          <w:szCs w:val="22"/>
+        </w:rPr>
+      </w:pPr>
       <w:r>
         <w:rPr>
           <w:rStyle w:val="fs14fw4"/>
-          <w:sz w:val="22"/>
-          <w:szCs w:val="22"/>
-        </w:rPr>
-        <w:t>Michigan High School Cricket Association</w:t>
-      </w:r>
-      <w:bookmarkEnd w:id="34"/>
-      <w:r>
-        <w:rPr>
-          <w:rStyle w:val="fs14fw4undefinedtdn"/>
-          <w:sz w:val="22"/>
-          <w:szCs w:val="22"/>
-        </w:rPr>
-        <w:t xml:space="preserve">, </w:t>
-      </w:r>
-      <w:bookmarkStart w:id="35" w:name="div_75"/>
-      <w:r>
-        <w:rPr>
-          <w:rStyle w:val="fs14fw4"/>
-          <w:sz w:val="22"/>
-          <w:szCs w:val="22"/>
-        </w:rPr>
-        <w:t>Canton, MI</w:t>
-      </w:r>
-      <w:bookmarkEnd w:id="35"/>
-      <w:r>
-        <w:rPr>
-          <w:rStyle w:val="fs14fw4"/>
-          <w:sz w:val="22"/>
-          <w:szCs w:val="22"/>
-        </w:rPr>
+          <w:b w:val="0"/>
+          <w:i w:val="0"/>
+          <w:sz w:val="20"/>
+          <w:szCs w:val="22"/>
+        </w:rPr>
+        <w:t>Michigan High School Cricket Association; Vice President</w:t>
         <w:tab/>
-      </w:r>
-      <w:bookmarkStart w:id="36" w:name="div_81"/>
-      <w:r>
-        <w:rPr>
-          <w:rStyle w:val="fs14fw4"/>
-          <w:sz w:val="22"/>
-          <w:szCs w:val="22"/>
-        </w:rPr>
-        <w:t>January 2024 - December 2026</w:t>
-      </w:r>
-      <w:bookmarkEnd w:id="36"/>
-    </w:p>
-    <w:p>
-      <w:pPr>
-        <w:spacing w:line="220" w:lineRule="atLeast"/>
-        <w:rPr>
-          <w:sz w:val="22"/>
-          <w:szCs w:val="22"/>
-        </w:rPr>
-      </w:pPr>
-      <w:bookmarkStart w:id="37" w:name="div_73"/>
-      <w:r>
-        <w:rPr>
-          <w:rStyle w:val="fs14fw4fsioverflow-hidden"/>
-          <w:i/>
-          <w:iCs/>
-          <w:sz w:val="22"/>
-          <w:szCs w:val="22"/>
-        </w:rPr>
-        <w:t>Vice President</w:t>
-      </w:r>
-      <w:bookmarkEnd w:id="37"/>
-      <w:r>
-        <w:rPr>
-          <w:sz w:val="22"/>
-          <w:szCs w:val="22"/>
-        </w:rPr>
-        <w:t xml:space="preserve"> </w:t>
+        <w:t>Jan 2024 – Present</w:t>
       </w:r>
     </w:p>
     <w:p>
@@ -1252,22 +927,44 @@
           <w:ilvl w:val="0"/>
           <w:numId w:val="5"/>
         </w:numPr>
-        <w:spacing w:line="220" w:lineRule="atLeast"/>
+        <w:spacing w:line="240" w:lineRule="auto" w:after="0" w:before="0"/>
         <w:ind w:hanging="366"/>
         <w:rPr>
           <w:sz w:val="22"/>
           <w:szCs w:val="22"/>
         </w:rPr>
       </w:pPr>
-      <w:bookmarkStart w:id="38" w:name="div_82"/>
-      <w:r>
-        <w:rPr>
-          <w:sz w:val="22"/>
-          <w:szCs w:val="22"/>
-        </w:rPr>
-        <w:t>Led an 8-person team organizing 5 tournaments for 12+ teams and 200+ players across Michigan.</w:t>
-      </w:r>
-      <w:bookmarkEnd w:id="38"/>
+      <w:r>
+        <w:rPr>
+          <w:sz w:val="20"/>
+          <w:szCs w:val="22"/>
+        </w:rPr>
+        <w:t>Led 8 organizers delivering 5 tournaments for 12+ teams and 200+ players; coordinated schedules, venues, and logistics.</w:t>
+      </w:r>
+    </w:p>
+    <w:p>
+      <w:pPr>
+        <w:tabs>
+          <w:tab w:pos="10787" w:val="right"/>
+        </w:tabs>
+        <w:spacing w:line="240" w:lineRule="auto" w:after="0" w:before="0"/>
+        <w:rPr>
+          <w:sz w:val="22"/>
+          <w:szCs w:val="22"/>
+        </w:rPr>
+      </w:pPr>
+      <w:r>
+        <w:rPr>
+          <w:rStyle w:val="fs14fw4"/>
+          <w:b w:val="0"/>
+          <w:i w:val="0"/>
+          <w:sz w:val="20"/>
+          <w:szCs w:val="22"/>
+        </w:rPr>
+        <w:t>Indian American Students Association; Choreographer</w:t>
+        <w:tab/>
+        <w:t>Oct 2024 – Feb 2026</w:t>
+      </w:r>
     </w:p>
     <w:p>
       <w:pPr>
@@ -1275,22 +972,341 @@
           <w:ilvl w:val="0"/>
           <w:numId w:val="5"/>
         </w:numPr>
-        <w:spacing w:line="220" w:lineRule="atLeast"/>
+        <w:spacing w:line="240" w:lineRule="auto" w:after="0" w:before="0"/>
         <w:ind w:hanging="366"/>
         <w:rPr>
           <w:sz w:val="22"/>
           <w:szCs w:val="22"/>
         </w:rPr>
       </w:pPr>
-      <w:bookmarkStart w:id="39" w:name="div_83"/>
-      <w:r>
-        <w:rPr>
-          <w:sz w:val="22"/>
-          <w:szCs w:val="22"/>
-        </w:rPr>
-        <w:t>Coordinated schedules, venues, and logistics; delegated tasks across the organizing team.</w:t>
-      </w:r>
-      <w:bookmarkEnd w:id="39"/>
+      <w:r>
+        <w:rPr>
+          <w:sz w:val="20"/>
+          <w:szCs w:val="22"/>
+        </w:rPr>
+        <w:t>Choreographed and trained 60 dancers within a 200+ member organization for 2 shows reaching 500+ attendees.</w:t>
+      </w:r>
+    </w:p>
+    <w:p>
+      <w:pPr>
+        <w:tabs>
+          <w:tab w:pos="10787" w:val="right"/>
+        </w:tabs>
+        <w:spacing w:line="240" w:lineRule="auto" w:after="0" w:before="0"/>
+        <w:rPr>
+          <w:sz w:val="22"/>
+          <w:szCs w:val="22"/>
+        </w:rPr>
+      </w:pPr>
+      <w:r>
+        <w:rPr>
+          <w:rStyle w:val="fs14fw4"/>
+          <w:b w:val="0"/>
+          <w:i w:val="0"/>
+          <w:sz w:val="20"/>
+          <w:szCs w:val="22"/>
+        </w:rPr>
+        <w:t>Troy High Volleyball Club; Vice President and Coach</w:t>
+        <w:tab/>
+        <w:t>Mar 2025 – Jun 2026</w:t>
+      </w:r>
+    </w:p>
+    <w:p>
+      <w:pPr>
+        <w:numPr>
+          <w:ilvl w:val="0"/>
+          <w:numId w:val="5"/>
+        </w:numPr>
+        <w:spacing w:line="240" w:lineRule="auto" w:after="0" w:before="0"/>
+        <w:ind w:hanging="366"/>
+        <w:rPr>
+          <w:sz w:val="22"/>
+          <w:szCs w:val="22"/>
+        </w:rPr>
+      </w:pPr>
+      <w:r>
+        <w:rPr>
+          <w:sz w:val="20"/>
+          <w:szCs w:val="22"/>
+        </w:rPr>
+        <w:t>Organized practices, coached volleyball fundamentals, and mentored developing players. Also competed on Troy’s varsity team, which placed second at regionals and 16th in Michigan.</w:t>
+      </w:r>
+    </w:p>
+    <w:p>
+      <w:pPr>
+        <w:tabs>
+          <w:tab w:pos="10787" w:val="right"/>
+        </w:tabs>
+        <w:spacing w:line="240" w:lineRule="auto" w:after="0" w:before="0"/>
+        <w:rPr>
+          <w:sz w:val="22"/>
+          <w:szCs w:val="22"/>
+        </w:rPr>
+      </w:pPr>
+      <w:r>
+        <w:rPr>
+          <w:rStyle w:val="fs14fw4"/>
+          <w:b w:val="0"/>
+          <w:i w:val="0"/>
+          <w:sz w:val="20"/>
+          <w:szCs w:val="22"/>
+        </w:rPr>
+        <w:t>Troy Xavira; Bollywood Fusion Dance Team Member</w:t>
+        <w:tab/>
+        <w:t>Jul 2025 – Jun 2026</w:t>
+      </w:r>
+    </w:p>
+    <w:p>
+      <w:pPr>
+        <w:numPr>
+          <w:ilvl w:val="0"/>
+          <w:numId w:val="5"/>
+        </w:numPr>
+        <w:spacing w:line="240" w:lineRule="auto" w:after="0" w:before="0"/>
+        <w:ind w:hanging="366"/>
+        <w:rPr>
+          <w:sz w:val="22"/>
+          <w:szCs w:val="22"/>
+        </w:rPr>
+      </w:pPr>
+      <w:r>
+        <w:rPr>
+          <w:sz w:val="20"/>
+          <w:szCs w:val="22"/>
+        </w:rPr>
+        <w:t>Collaborated on choreography and team performances; won first place at Michigan’s largest Bollywood fusion dance competition.</w:t>
+      </w:r>
+    </w:p>
+    <w:p>
+      <w:pPr>
+        <w:pBdr>
+          <w:bottom w:val="single" w:sz="6" w:space="0" w:color="000000"/>
+        </w:pBdr>
+        <w:spacing w:line="240" w:lineRule="auto" w:after="0" w:before="20"/>
+        <w:rPr>
+          <w:b/>
+          <w:bCs/>
+          <w:caps/>
+          <w:sz w:val="22"/>
+          <w:szCs w:val="22"/>
+        </w:rPr>
+      </w:pPr>
+      <w:bookmarkStart w:id="40" w:name="381786091174206"/>
+      <w:r>
+        <w:rPr>
+          <w:b/>
+          <w:bCs/>
+          <w:caps/>
+          <w:sz w:val="20"/>
+          <w:szCs w:val="22"/>
+        </w:rPr>
+        <w:t>TECHNICAL SKILLS AND CERTIFICATIONS</w:t>
+      </w:r>
+      <w:bookmarkEnd w:id="40"/>
+      <w:r>
+        <w:rPr>
+          <w:b/>
+          <w:bCs/>
+          <w:caps/>
+          <w:sz w:val="20"/>
+          <w:szCs w:val="22"/>
+        </w:rPr>
+      </w:r>
+    </w:p>
+    <w:p>
+      <w:pPr>
+        <w:numPr>
+          <w:ilvl w:val="0"/>
+          <w:numId w:val="7"/>
+        </w:numPr>
+        <w:spacing w:line="240" w:lineRule="auto" w:after="0" w:before="0"/>
+        <w:ind w:hanging="366"/>
+        <w:rPr>
+          <w:sz w:val="22"/>
+          <w:szCs w:val="22"/>
+        </w:rPr>
+      </w:pPr>
+      <w:bookmarkStart w:id="41" w:name="div_85"/>
+      <w:r>
+        <w:rPr>
+          <w:sz w:val="20"/>
+          <w:szCs w:val="22"/>
+        </w:rPr>
+        <w:t>CAD: SolidWorks, AutoCAD (beginner, self-taught) | Microsoft Office: Excel, PowerPoint, Word</w:t>
+      </w:r>
+      <w:bookmarkEnd w:id="41"/>
+    </w:p>
+    <w:p>
+      <w:pPr>
+        <w:numPr>
+          <w:ilvl w:val="0"/>
+          <w:numId w:val="7"/>
+        </w:numPr>
+        <w:spacing w:line="240" w:lineRule="auto" w:after="0" w:before="0"/>
+        <w:ind w:hanging="366"/>
+        <w:rPr>
+          <w:sz w:val="22"/>
+          <w:szCs w:val="22"/>
+        </w:rPr>
+      </w:pPr>
+      <w:bookmarkStart w:id="42" w:name="div_86"/>
+      <w:r>
+        <w:rPr>
+          <w:sz w:val="20"/>
+          <w:szCs w:val="22"/>
+        </w:rPr>
+        <w:t>Programming and databases: Java, MySQL, Firebase</w:t>
+      </w:r>
+      <w:bookmarkEnd w:id="42"/>
+    </w:p>
+    <w:p>
+      <w:pPr>
+        <w:numPr>
+          <w:ilvl w:val="0"/>
+          <w:numId w:val="7"/>
+        </w:numPr>
+        <w:spacing w:line="240" w:lineRule="auto" w:after="0" w:before="0"/>
+        <w:ind w:hanging="366"/>
+        <w:rPr>
+          <w:sz w:val="22"/>
+          <w:szCs w:val="22"/>
+        </w:rPr>
+      </w:pPr>
+      <w:bookmarkStart w:id="43" w:name="div_87"/>
+      <w:r>
+        <w:rPr>
+          <w:sz w:val="20"/>
+          <w:szCs w:val="22"/>
+        </w:rPr>
+        <w:t>Web development: HTML, JavaScript, GitHub, AI-assisted tools</w:t>
+      </w:r>
+      <w:bookmarkEnd w:id="43"/>
+    </w:p>
+    <w:p>
+      <w:pPr>
+        <w:numPr>
+          <w:ilvl w:val="0"/>
+          <w:numId w:val="7"/>
+        </w:numPr>
+        <w:spacing w:line="240" w:lineRule="auto" w:after="0" w:before="0"/>
+        <w:ind w:hanging="366"/>
+        <w:rPr>
+          <w:sz w:val="22"/>
+          <w:szCs w:val="22"/>
+        </w:rPr>
+      </w:pPr>
+      <w:r>
+        <w:rPr>
+          <w:sz w:val="20"/>
+          <w:szCs w:val="22"/>
+        </w:rPr>
+        <w:t>Cybersecurity fundamentals: threat analysis, incident response, network security, and risk management</w:t>
+      </w:r>
+    </w:p>
+    <w:p>
+      <w:pPr>
+        <w:numPr>
+          <w:ilvl w:val="0"/>
+          <w:numId w:val="7"/>
+        </w:numPr>
+        <w:spacing w:line="240" w:lineRule="auto" w:after="0" w:before="0"/>
+        <w:ind w:hanging="366"/>
+        <w:rPr>
+          <w:sz w:val="22"/>
+          <w:szCs w:val="22"/>
+        </w:rPr>
+      </w:pPr>
+      <w:r>
+        <w:rPr>
+          <w:sz w:val="20"/>
+          <w:szCs w:val="22"/>
+        </w:rPr>
+        <w:t>Systems and networking: Linux administration, TCP/IP, DNS, and Git version control (foundational)</w:t>
+      </w:r>
+    </w:p>
+    <w:p>
+      <w:pPr>
+        <w:numPr>
+          <w:ilvl w:val="0"/>
+          <w:numId w:val="7"/>
+        </w:numPr>
+        <w:spacing w:line="240" w:lineRule="auto" w:after="0" w:before="0"/>
+        <w:ind w:hanging="366"/>
+        <w:rPr>
+          <w:sz w:val="22"/>
+          <w:szCs w:val="22"/>
+        </w:rPr>
+      </w:pPr>
+      <w:r>
+        <w:rPr>
+          <w:sz w:val="20"/>
+          <w:szCs w:val="22"/>
+        </w:rPr>
+        <w:t>Cloud architecture: cloud deployment, infrastructure design, and cloud security frameworks (foundational)</w:t>
+      </w:r>
+    </w:p>
+    <w:p>
+      <w:pPr>
+        <w:numPr>
+          <w:ilvl w:val="0"/>
+          <w:numId w:val="7"/>
+        </w:numPr>
+        <w:spacing w:line="240" w:lineRule="auto" w:after="0" w:before="0"/>
+        <w:ind w:hanging="366"/>
+        <w:rPr>
+          <w:sz w:val="22"/>
+          <w:szCs w:val="22"/>
+        </w:rPr>
+      </w:pPr>
+      <w:r>
+        <w:rPr>
+          <w:sz w:val="20"/>
+          <w:szCs w:val="22"/>
+        </w:rPr>
+        <w:t>AI and prompt engineering: generative AI tools, prompt optimization, and no-code AI model evaluation</w:t>
+      </w:r>
+    </w:p>
+    <w:p>
+      <w:pPr>
+        <w:numPr>
+          <w:ilvl w:val="0"/>
+          <w:numId w:val="7"/>
+        </w:numPr>
+        <w:spacing w:line="240" w:lineRule="auto" w:after="0" w:before="0"/>
+        <w:ind w:hanging="366"/>
+        <w:rPr>
+          <w:sz w:val="22"/>
+          <w:szCs w:val="22"/>
+        </w:rPr>
+      </w:pPr>
+      <w:r>
+        <w:rPr>
+          <w:sz w:val="20"/>
+          <w:szCs w:val="22"/>
+        </w:rPr>
+        <w:t>Languages: Tamil, English, Malayalam; additional knowledge of Hindi</w:t>
+      </w:r>
+    </w:p>
+    <w:p>
+      <w:pPr>
+        <w:numPr>
+          <w:ilvl w:val="0"/>
+          <w:numId w:val="7"/>
+        </w:numPr>
+        <w:spacing w:line="240" w:lineRule="auto" w:after="0" w:before="0"/>
+        <w:ind w:hanging="366"/>
+        <w:rPr>
+          <w:sz w:val="22"/>
+          <w:szCs w:val="22"/>
+        </w:rPr>
+      </w:pPr>
+      <w:r>
+        <w:rPr>
+          <w:sz w:val="20"/>
+          <w:szCs w:val="22"/>
+        </w:rPr>
+        <w:t>Certifications: CPR and First Aid; Biliteracy in English and Tamil</w:t>
+      </w:r>
     </w:p>
     <w:sectPr>
       <w:pgSz w:w="12225" w:h="15810"/>

</xml_diff>

<commit_message>
Organize learning sources and publish confirmed resume
Separate university coursework, self-directed topics, confirmed in-progress online courses and six saved future courses. Replace Word download with the user-confirmed latest source; its text matches the existing readable resume.
</commit_message>
<xml_diff>
--- a/Amrit_Prabhu_Resume.docx
+++ b/Amrit_Prabhu_Resume.docx
@@ -4,10 +4,8 @@
   <w:body>
     <w:p>
       <w:pPr>
-        <w:pBdr>
-          <w:bottom w:val="single" w:sz="6" w:space="0" w:color="FFFFFF"/>
-        </w:pBdr>
-        <w:spacing w:line="240" w:lineRule="auto" w:after="0" w:before="0"/>
+        <w:keepNext w:val="0"/>
+        <w:spacing w:line="400" w:lineRule="exact" w:after="60" w:before="0"/>
         <w:jc w:val="center"/>
         <w:rPr>
           <w:sz w:val="22"/>
@@ -17,9 +15,12 @@
       <w:bookmarkStart w:id="0" w:name="personal_information-info-name"/>
       <w:r>
         <w:rPr>
+          <w:rFonts w:ascii="Times New Roman" w:hAnsi="Times New Roman"/>
           <w:b/>
           <w:bCs/>
-          <w:sz w:val="28"/>
+          <w:i w:val="0"/>
+          <w:color w:val="000000"/>
+          <w:sz w:val="32"/>
           <w:szCs w:val="28"/>
         </w:rPr>
         <w:t>AMRIT KRISHNA PRABHU</w:t>
@@ -28,10 +29,8 @@
     </w:p>
     <w:p>
       <w:pPr>
-        <w:pBdr>
-          <w:bottom w:val="single" w:sz="6" w:space="0" w:color="FFFFFF"/>
-        </w:pBdr>
-        <w:spacing w:line="240" w:lineRule="auto" w:after="0" w:before="0"/>
+        <w:keepNext w:val="0"/>
+        <w:spacing w:line="240" w:lineRule="exact" w:after="60" w:before="0"/>
         <w:jc w:val="center"/>
         <w:rPr>
           <w:sz w:val="22"/>
@@ -40,6 +39,10 @@
       </w:pPr>
       <w:r>
         <w:rPr>
+          <w:rFonts w:ascii="Times New Roman" w:hAnsi="Times New Roman"/>
+          <w:b/>
+          <w:i w:val="0"/>
+          <w:color w:val="000000"/>
           <w:sz w:val="20"/>
         </w:rPr>
         <w:t>Troy, MI | 248-825-6377 | prab2534@kettering.edu | linkedin.com/in/amrit-krishna-prabhu</w:t>
@@ -47,10 +50,8 @@
     </w:p>
     <w:p>
       <w:pPr>
-        <w:pBdr>
-          <w:bottom w:val="single" w:sz="6" w:space="0" w:color="000000"/>
-        </w:pBdr>
-        <w:spacing w:line="240" w:lineRule="auto" w:after="0" w:before="20"/>
+        <w:keepNext/>
+        <w:spacing w:line="240" w:lineRule="exact" w:after="40" w:before="80"/>
         <w:rPr>
           <w:b/>
           <w:bCs/>
@@ -58,14 +59,20 @@
           <w:sz w:val="22"/>
           <w:szCs w:val="22"/>
         </w:rPr>
+        <w:pBdr>
+          <w:top w:val="single" w:sz="5" w:color="000000" w:space="3"/>
+        </w:pBdr>
       </w:pPr>
       <w:bookmarkStart w:id="5" w:name="103365482976153"/>
       <w:r>
         <w:rPr>
+          <w:rFonts w:ascii="Times New Roman" w:hAnsi="Times New Roman"/>
           <w:b/>
           <w:bCs/>
+          <w:i w:val="0"/>
           <w:caps/>
-          <w:sz w:val="20"/>
+          <w:color w:val="000000"/>
+          <w:sz w:val="22"/>
           <w:szCs w:val="22"/>
         </w:rPr>
         <w:t>EDUCATION</w:t>
@@ -74,10 +81,11 @@
     </w:p>
     <w:p>
       <w:pPr>
-        <w:tabs>
-          <w:tab w:pos="10787" w:val="right"/>
-        </w:tabs>
-        <w:spacing w:line="240" w:lineRule="auto" w:after="0" w:before="0"/>
+        <w:keepNext/>
+        <w:tabs>
+          <w:tab w:pos="10800" w:val="right"/>
+        </w:tabs>
+        <w:spacing w:line="220" w:lineRule="exact" w:after="0" w:before="40"/>
         <w:rPr>
           <w:sz w:val="22"/>
           <w:szCs w:val="22"/>
@@ -87,6 +95,10 @@
       <w:r>
         <w:rPr>
           <w:rStyle w:val="fs14fw4"/>
+          <w:rFonts w:ascii="Times New Roman" w:hAnsi="Times New Roman"/>
+          <w:b w:val="0"/>
+          <w:i w:val="0"/>
+          <w:color w:val="000000"/>
           <w:sz w:val="20"/>
           <w:szCs w:val="22"/>
         </w:rPr>
@@ -98,6 +110,10 @@
       <w:r>
         <w:rPr>
           <w:rStyle w:val="fs14fw4undefinedtdn"/>
+          <w:rFonts w:ascii="Times New Roman" w:hAnsi="Times New Roman"/>
+          <w:b w:val="0"/>
+          <w:i w:val="0"/>
+          <w:color w:val="000000"/>
           <w:sz w:val="20"/>
           <w:szCs w:val="22"/>
         </w:rPr>
@@ -106,6 +122,10 @@
       <w:r>
         <w:rPr>
           <w:rStyle w:val="fs14fw4"/>
+          <w:rFonts w:ascii="Times New Roman" w:hAnsi="Times New Roman"/>
+          <w:b w:val="0"/>
+          <w:i w:val="0"/>
+          <w:color w:val="000000"/>
           <w:sz w:val="20"/>
           <w:szCs w:val="22"/>
         </w:rPr>
@@ -114,6 +134,10 @@
       <w:r>
         <w:rPr>
           <w:rStyle w:val="fs14fw4"/>
+          <w:rFonts w:ascii="Times New Roman" w:hAnsi="Times New Roman"/>
+          <w:b w:val="0"/>
+          <w:i w:val="0"/>
+          <w:color w:val="000000"/>
           <w:sz w:val="20"/>
           <w:szCs w:val="22"/>
         </w:rPr>
@@ -122,6 +146,10 @@
       <w:r>
         <w:rPr>
           <w:rStyle w:val="fs14fw4"/>
+          <w:rFonts w:ascii="Times New Roman" w:hAnsi="Times New Roman"/>
+          <w:b w:val="0"/>
+          <w:i w:val="0"/>
+          <w:color w:val="000000"/>
           <w:sz w:val="20"/>
           <w:szCs w:val="22"/>
         </w:rPr>
@@ -130,7 +158,8 @@
     </w:p>
     <w:p>
       <w:pPr>
-        <w:spacing w:line="240" w:lineRule="auto" w:after="0" w:before="0"/>
+        <w:keepNext w:val="0"/>
+        <w:spacing w:line="220" w:lineRule="exact" w:after="0" w:before="0"/>
         <w:rPr>
           <w:sz w:val="22"/>
           <w:szCs w:val="22"/>
@@ -140,6 +169,10 @@
       <w:r>
         <w:rPr>
           <w:rStyle w:val="fs14fw4overflow-hidden"/>
+          <w:rFonts w:ascii="Times New Roman" w:hAnsi="Times New Roman"/>
+          <w:b w:val="0"/>
+          <w:i w:val="0"/>
+          <w:color w:val="000000"/>
           <w:sz w:val="20"/>
           <w:szCs w:val="22"/>
         </w:rPr>
@@ -148,6 +181,10 @@
       <w:bookmarkEnd w:id="9"/>
       <w:r>
         <w:rPr>
+          <w:rFonts w:ascii="Times New Roman" w:hAnsi="Times New Roman"/>
+          <w:b w:val="0"/>
+          <w:i w:val="0"/>
+          <w:color w:val="000000"/>
           <w:sz w:val="20"/>
           <w:szCs w:val="22"/>
         </w:rPr>
@@ -155,6 +192,10 @@
       </w:r>
       <w:r>
         <w:rPr>
+          <w:rFonts w:ascii="Times New Roman" w:hAnsi="Times New Roman"/>
+          <w:b w:val="0"/>
+          <w:i w:val="0"/>
+          <w:color w:val="000000"/>
           <w:sz w:val="20"/>
           <w:szCs w:val="22"/>
         </w:rPr>
@@ -163,11 +204,12 @@
     </w:p>
     <w:p>
       <w:pPr>
+        <w:keepNext w:val="0"/>
         <w:numPr>
           <w:ilvl w:val="0"/>
           <w:numId w:val="1"/>
         </w:numPr>
-        <w:spacing w:line="240" w:lineRule="auto" w:after="0" w:before="0"/>
+        <w:spacing w:line="220" w:lineRule="exact" w:after="0" w:before="0"/>
         <w:ind w:hanging="366"/>
         <w:rPr>
           <w:sz w:val="22"/>
@@ -176,6 +218,10 @@
       </w:pPr>
       <w:r>
         <w:rPr>
+          <w:rFonts w:ascii="Times New Roman" w:hAnsi="Times New Roman"/>
+          <w:b w:val="0"/>
+          <w:i w:val="0"/>
+          <w:color w:val="000000"/>
           <w:sz w:val="20"/>
           <w:szCs w:val="22"/>
         </w:rPr>
@@ -184,11 +230,12 @@
     </w:p>
     <w:p>
       <w:pPr>
+        <w:keepNext w:val="0"/>
         <w:numPr>
           <w:ilvl w:val="0"/>
           <w:numId w:val="1"/>
         </w:numPr>
-        <w:spacing w:line="240" w:lineRule="auto" w:after="0" w:before="0"/>
+        <w:spacing w:line="220" w:lineRule="exact" w:after="0" w:before="0"/>
         <w:ind w:hanging="366"/>
         <w:rPr>
           <w:sz w:val="22"/>
@@ -197,6 +244,10 @@
       </w:pPr>
       <w:r>
         <w:rPr>
+          <w:rFonts w:ascii="Times New Roman" w:hAnsi="Times New Roman"/>
+          <w:b w:val="0"/>
+          <w:i w:val="0"/>
+          <w:color w:val="000000"/>
           <w:sz w:val="20"/>
           <w:szCs w:val="22"/>
         </w:rPr>
@@ -205,17 +256,22 @@
     </w:p>
     <w:p>
       <w:pPr>
-        <w:tabs>
-          <w:tab w:pos="10787" w:val="right"/>
-        </w:tabs>
-        <w:spacing w:line="240" w:lineRule="auto" w:after="0" w:before="0"/>
-        <w:rPr>
-          <w:sz w:val="22"/>
-          <w:szCs w:val="22"/>
-        </w:rPr>
-      </w:pPr>
-      <w:r>
-        <w:rPr>
+        <w:keepNext/>
+        <w:tabs>
+          <w:tab w:pos="10800" w:val="right"/>
+        </w:tabs>
+        <w:spacing w:line="220" w:lineRule="exact" w:after="0" w:before="40"/>
+        <w:rPr>
+          <w:sz w:val="22"/>
+          <w:szCs w:val="22"/>
+        </w:rPr>
+      </w:pPr>
+      <w:r>
+        <w:rPr>
+          <w:rFonts w:ascii="Times New Roman" w:hAnsi="Times New Roman"/>
+          <w:b w:val="0"/>
+          <w:i w:val="0"/>
+          <w:color w:val="000000"/>
           <w:sz w:val="20"/>
           <w:szCs w:val="22"/>
         </w:rPr>
@@ -225,84 +281,140 @@
       </w:r>
       <w:r>
         <w:rPr>
-          <w:sz w:val="20"/>
-          <w:szCs w:val="22"/>
-        </w:rPr>
-      </w:r>
-      <w:r>
-        <w:rPr>
-          <w:sz w:val="20"/>
-          <w:szCs w:val="22"/>
-        </w:rPr>
-      </w:r>
-      <w:r>
-        <w:rPr>
-          <w:sz w:val="20"/>
-          <w:szCs w:val="22"/>
-        </w:rPr>
-      </w:r>
-      <w:r>
-        <w:rPr>
-          <w:sz w:val="20"/>
-          <w:szCs w:val="22"/>
-        </w:rPr>
-      </w:r>
-      <w:r>
-        <w:rPr>
-          <w:sz w:val="20"/>
-          <w:szCs w:val="22"/>
-        </w:rPr>
-      </w:r>
-      <w:r>
-        <w:rPr>
-          <w:sz w:val="20"/>
-          <w:szCs w:val="22"/>
-        </w:rPr>
-      </w:r>
-      <w:r>
-        <w:rPr>
-          <w:sz w:val="20"/>
-          <w:szCs w:val="22"/>
-        </w:rPr>
-      </w:r>
-      <w:r>
-        <w:rPr>
-          <w:sz w:val="20"/>
-          <w:szCs w:val="22"/>
-        </w:rPr>
-      </w:r>
-      <w:r>
-        <w:rPr>
-          <w:sz w:val="20"/>
-          <w:szCs w:val="22"/>
-        </w:rPr>
-      </w:r>
-      <w:r>
-        <w:rPr>
-          <w:sz w:val="20"/>
-          <w:szCs w:val="22"/>
-        </w:rPr>
-      </w:r>
-      <w:r>
-        <w:rPr>
-          <w:sz w:val="20"/>
-          <w:szCs w:val="22"/>
-        </w:rPr>
-      </w:r>
-      <w:r>
-        <w:rPr>
-          <w:sz w:val="20"/>
-          <w:szCs w:val="22"/>
-        </w:rPr>
-      </w:r>
-      <w:r>
-        <w:rPr>
-          <w:sz w:val="20"/>
-          <w:szCs w:val="22"/>
-        </w:rPr>
-      </w:r>
-      <w:r>
-        <w:rPr>
+          <w:rFonts w:ascii="Times New Roman" w:hAnsi="Times New Roman"/>
+          <w:b w:val="0"/>
+          <w:i w:val="0"/>
+          <w:color w:val="000000"/>
+          <w:sz w:val="20"/>
+          <w:szCs w:val="22"/>
+        </w:rPr>
+      </w:r>
+      <w:r>
+        <w:rPr>
+          <w:rFonts w:ascii="Times New Roman" w:hAnsi="Times New Roman"/>
+          <w:b w:val="0"/>
+          <w:i w:val="0"/>
+          <w:color w:val="000000"/>
+          <w:sz w:val="20"/>
+          <w:szCs w:val="22"/>
+        </w:rPr>
+      </w:r>
+      <w:r>
+        <w:rPr>
+          <w:rFonts w:ascii="Times New Roman" w:hAnsi="Times New Roman"/>
+          <w:b w:val="0"/>
+          <w:i w:val="0"/>
+          <w:color w:val="000000"/>
+          <w:sz w:val="20"/>
+          <w:szCs w:val="22"/>
+        </w:rPr>
+      </w:r>
+      <w:r>
+        <w:rPr>
+          <w:rFonts w:ascii="Times New Roman" w:hAnsi="Times New Roman"/>
+          <w:b w:val="0"/>
+          <w:i w:val="0"/>
+          <w:color w:val="000000"/>
+          <w:sz w:val="20"/>
+          <w:szCs w:val="22"/>
+        </w:rPr>
+      </w:r>
+      <w:r>
+        <w:rPr>
+          <w:rFonts w:ascii="Times New Roman" w:hAnsi="Times New Roman"/>
+          <w:b w:val="0"/>
+          <w:i w:val="0"/>
+          <w:color w:val="000000"/>
+          <w:sz w:val="20"/>
+          <w:szCs w:val="22"/>
+        </w:rPr>
+      </w:r>
+      <w:r>
+        <w:rPr>
+          <w:rFonts w:ascii="Times New Roman" w:hAnsi="Times New Roman"/>
+          <w:b w:val="0"/>
+          <w:i w:val="0"/>
+          <w:color w:val="000000"/>
+          <w:sz w:val="20"/>
+          <w:szCs w:val="22"/>
+        </w:rPr>
+      </w:r>
+      <w:r>
+        <w:rPr>
+          <w:rFonts w:ascii="Times New Roman" w:hAnsi="Times New Roman"/>
+          <w:b w:val="0"/>
+          <w:i w:val="0"/>
+          <w:color w:val="000000"/>
+          <w:sz w:val="20"/>
+          <w:szCs w:val="22"/>
+        </w:rPr>
+      </w:r>
+      <w:r>
+        <w:rPr>
+          <w:rFonts w:ascii="Times New Roman" w:hAnsi="Times New Roman"/>
+          <w:b w:val="0"/>
+          <w:i w:val="0"/>
+          <w:color w:val="000000"/>
+          <w:sz w:val="20"/>
+          <w:szCs w:val="22"/>
+        </w:rPr>
+      </w:r>
+      <w:r>
+        <w:rPr>
+          <w:rFonts w:ascii="Times New Roman" w:hAnsi="Times New Roman"/>
+          <w:b w:val="0"/>
+          <w:i w:val="0"/>
+          <w:color w:val="000000"/>
+          <w:sz w:val="20"/>
+          <w:szCs w:val="22"/>
+        </w:rPr>
+      </w:r>
+      <w:r>
+        <w:rPr>
+          <w:rFonts w:ascii="Times New Roman" w:hAnsi="Times New Roman"/>
+          <w:b w:val="0"/>
+          <w:i w:val="0"/>
+          <w:color w:val="000000"/>
+          <w:sz w:val="20"/>
+          <w:szCs w:val="22"/>
+        </w:rPr>
+      </w:r>
+      <w:r>
+        <w:rPr>
+          <w:rFonts w:ascii="Times New Roman" w:hAnsi="Times New Roman"/>
+          <w:b w:val="0"/>
+          <w:i w:val="0"/>
+          <w:color w:val="000000"/>
+          <w:sz w:val="20"/>
+          <w:szCs w:val="22"/>
+        </w:rPr>
+      </w:r>
+      <w:r>
+        <w:rPr>
+          <w:rFonts w:ascii="Times New Roman" w:hAnsi="Times New Roman"/>
+          <w:b w:val="0"/>
+          <w:i w:val="0"/>
+          <w:color w:val="000000"/>
+          <w:sz w:val="20"/>
+          <w:szCs w:val="22"/>
+        </w:rPr>
+      </w:r>
+      <w:r>
+        <w:rPr>
+          <w:rFonts w:ascii="Times New Roman" w:hAnsi="Times New Roman"/>
+          <w:b w:val="0"/>
+          <w:i w:val="0"/>
+          <w:color w:val="000000"/>
+          <w:sz w:val="20"/>
+          <w:szCs w:val="22"/>
+        </w:rPr>
+      </w:r>
+      <w:r>
+        <w:rPr>
+          <w:rFonts w:ascii="Times New Roman" w:hAnsi="Times New Roman"/>
+          <w:b w:val="0"/>
+          <w:i w:val="0"/>
+          <w:color w:val="000000"/>
           <w:sz w:val="20"/>
           <w:szCs w:val="22"/>
         </w:rPr>
@@ -311,18 +423,23 @@
     <w:p>
       <w:pPr>
         <w:pStyle w:val="ListParagraph"/>
+        <w:keepNext w:val="0"/>
         <w:numPr>
           <w:ilvl w:val="0"/>
           <w:numId w:val="1"/>
         </w:numPr>
-        <w:spacing w:line="240" w:lineRule="auto" w:after="0" w:before="0"/>
-        <w:rPr>
-          <w:sz w:val="22"/>
-          <w:szCs w:val="22"/>
-        </w:rPr>
-      </w:pPr>
-      <w:r>
-        <w:rPr>
+        <w:spacing w:line="220" w:lineRule="exact" w:after="0" w:before="0"/>
+        <w:rPr>
+          <w:sz w:val="22"/>
+          <w:szCs w:val="22"/>
+        </w:rPr>
+      </w:pPr>
+      <w:r>
+        <w:rPr>
+          <w:rFonts w:ascii="Times New Roman" w:hAnsi="Times New Roman"/>
+          <w:b w:val="0"/>
+          <w:i w:val="0"/>
+          <w:color w:val="000000"/>
           <w:sz w:val="20"/>
           <w:szCs w:val="22"/>
         </w:rPr>
@@ -331,10 +448,8 @@
     </w:p>
     <w:p>
       <w:pPr>
-        <w:pBdr>
-          <w:bottom w:val="single" w:sz="6" w:space="0" w:color="000000"/>
-        </w:pBdr>
-        <w:spacing w:line="240" w:lineRule="auto" w:after="0" w:before="20"/>
+        <w:keepNext/>
+        <w:spacing w:line="240" w:lineRule="exact" w:after="40" w:before="80"/>
         <w:rPr>
           <w:b/>
           <w:bCs/>
@@ -342,14 +457,20 @@
           <w:sz w:val="22"/>
           <w:szCs w:val="22"/>
         </w:rPr>
+        <w:pBdr>
+          <w:top w:val="single" w:sz="5" w:color="000000" w:space="3"/>
+        </w:pBdr>
       </w:pPr>
       <w:bookmarkStart w:id="12" w:name="389182222891180"/>
       <w:r>
         <w:rPr>
+          <w:rFonts w:ascii="Times New Roman" w:hAnsi="Times New Roman"/>
           <w:b/>
           <w:bCs/>
+          <w:i w:val="0"/>
           <w:caps/>
-          <w:sz w:val="20"/>
+          <w:color w:val="000000"/>
+          <w:sz w:val="22"/>
           <w:szCs w:val="22"/>
         </w:rPr>
         <w:t>TECHNICAL EXPERIENCE</w:t>
@@ -358,10 +479,11 @@
     </w:p>
     <w:p>
       <w:pPr>
-        <w:tabs>
-          <w:tab w:pos="10787" w:val="right"/>
-        </w:tabs>
-        <w:spacing w:line="240" w:lineRule="auto" w:after="0" w:before="0"/>
+        <w:keepNext/>
+        <w:tabs>
+          <w:tab w:pos="10800" w:val="right"/>
+        </w:tabs>
+        <w:spacing w:line="220" w:lineRule="exact" w:after="0" w:before="40"/>
         <w:rPr>
           <w:sz w:val="22"/>
           <w:szCs w:val="22"/>
@@ -371,6 +493,10 @@
       <w:r>
         <w:rPr>
           <w:rStyle w:val="fs14fw4"/>
+          <w:rFonts w:ascii="Times New Roman" w:hAnsi="Times New Roman"/>
+          <w:b w:val="0"/>
+          <w:i w:val="0"/>
+          <w:color w:val="000000"/>
           <w:sz w:val="20"/>
           <w:szCs w:val="22"/>
         </w:rPr>
@@ -382,6 +508,10 @@
       <w:r>
         <w:rPr>
           <w:rStyle w:val="fs14fw4undefinedtdn"/>
+          <w:rFonts w:ascii="Times New Roman" w:hAnsi="Times New Roman"/>
+          <w:b w:val="0"/>
+          <w:i w:val="0"/>
+          <w:color w:val="000000"/>
           <w:sz w:val="20"/>
           <w:szCs w:val="22"/>
         </w:rPr>
@@ -390,6 +520,10 @@
       <w:r>
         <w:rPr>
           <w:rStyle w:val="fs14fw4"/>
+          <w:rFonts w:ascii="Times New Roman" w:hAnsi="Times New Roman"/>
+          <w:b w:val="0"/>
+          <w:i w:val="0"/>
+          <w:color w:val="000000"/>
           <w:sz w:val="20"/>
           <w:szCs w:val="22"/>
         </w:rPr>
@@ -398,6 +532,10 @@
       <w:r>
         <w:rPr>
           <w:rStyle w:val="fs14fw4"/>
+          <w:rFonts w:ascii="Times New Roman" w:hAnsi="Times New Roman"/>
+          <w:b w:val="0"/>
+          <w:i w:val="0"/>
+          <w:color w:val="000000"/>
           <w:sz w:val="20"/>
           <w:szCs w:val="22"/>
         </w:rPr>
@@ -406,6 +544,10 @@
       <w:r>
         <w:rPr>
           <w:rStyle w:val="fs14fw4"/>
+          <w:rFonts w:ascii="Times New Roman" w:hAnsi="Times New Roman"/>
+          <w:b w:val="0"/>
+          <w:i w:val="0"/>
+          <w:color w:val="000000"/>
           <w:sz w:val="20"/>
           <w:szCs w:val="22"/>
         </w:rPr>
@@ -414,7 +556,8 @@
     </w:p>
     <w:p>
       <w:pPr>
-        <w:spacing w:line="240" w:lineRule="auto" w:after="0" w:before="0"/>
+        <w:keepNext/>
+        <w:spacing w:line="220" w:lineRule="exact" w:after="0" w:before="0"/>
         <w:rPr>
           <w:sz w:val="22"/>
           <w:szCs w:val="22"/>
@@ -424,8 +567,11 @@
       <w:r>
         <w:rPr>
           <w:rStyle w:val="fs14fw4fsioverflow-hidden"/>
-          <w:i/>
+          <w:rFonts w:ascii="Times New Roman" w:hAnsi="Times New Roman"/>
+          <w:b w:val="0"/>
+          <w:i w:val="0"/>
           <w:iCs/>
+          <w:color w:val="000000"/>
           <w:sz w:val="20"/>
           <w:szCs w:val="22"/>
         </w:rPr>
@@ -434,6 +580,10 @@
       <w:bookmarkEnd w:id="16"/>
       <w:r>
         <w:rPr>
+          <w:rFonts w:ascii="Times New Roman" w:hAnsi="Times New Roman"/>
+          <w:b w:val="0"/>
+          <w:i w:val="0"/>
+          <w:color w:val="000000"/>
           <w:sz w:val="20"/>
           <w:szCs w:val="22"/>
         </w:rPr>
@@ -442,11 +592,12 @@
     </w:p>
     <w:p>
       <w:pPr>
+        <w:keepNext w:val="0"/>
         <w:numPr>
           <w:ilvl w:val="0"/>
           <w:numId w:val="2"/>
         </w:numPr>
-        <w:spacing w:line="240" w:lineRule="auto" w:after="0" w:before="0"/>
+        <w:spacing w:line="220" w:lineRule="exact" w:after="0" w:before="0"/>
         <w:ind w:hanging="366"/>
         <w:rPr>
           <w:sz w:val="22"/>
@@ -455,6 +606,10 @@
       </w:pPr>
       <w:r>
         <w:rPr>
+          <w:rFonts w:ascii="Times New Roman" w:hAnsi="Times New Roman"/>
+          <w:b w:val="0"/>
+          <w:i w:val="0"/>
+          <w:color w:val="000000"/>
           <w:sz w:val="20"/>
           <w:szCs w:val="22"/>
         </w:rPr>
@@ -463,11 +618,12 @@
     </w:p>
     <w:p>
       <w:pPr>
+        <w:keepNext w:val="0"/>
         <w:numPr>
           <w:ilvl w:val="0"/>
           <w:numId w:val="2"/>
         </w:numPr>
-        <w:spacing w:line="240" w:lineRule="auto" w:after="0" w:before="0"/>
+        <w:spacing w:line="220" w:lineRule="exact" w:after="0" w:before="0"/>
         <w:ind w:hanging="366"/>
         <w:rPr>
           <w:sz w:val="22"/>
@@ -476,6 +632,10 @@
       </w:pPr>
       <w:r>
         <w:rPr>
+          <w:rFonts w:ascii="Times New Roman" w:hAnsi="Times New Roman"/>
+          <w:b w:val="0"/>
+          <w:i w:val="0"/>
+          <w:color w:val="000000"/>
           <w:sz w:val="20"/>
           <w:szCs w:val="22"/>
         </w:rPr>
@@ -484,11 +644,12 @@
     </w:p>
     <w:p>
       <w:pPr>
+        <w:keepNext w:val="0"/>
         <w:numPr>
           <w:ilvl w:val="0"/>
           <w:numId w:val="2"/>
         </w:numPr>
-        <w:spacing w:line="240" w:lineRule="auto" w:after="0" w:before="0"/>
+        <w:spacing w:line="220" w:lineRule="exact" w:after="0" w:before="0"/>
         <w:ind w:hanging="366"/>
         <w:rPr>
           <w:sz w:val="22"/>
@@ -497,6 +658,10 @@
       </w:pPr>
       <w:r>
         <w:rPr>
+          <w:rFonts w:ascii="Times New Roman" w:hAnsi="Times New Roman"/>
+          <w:b w:val="0"/>
+          <w:i w:val="0"/>
+          <w:color w:val="000000"/>
           <w:sz w:val="20"/>
           <w:szCs w:val="22"/>
         </w:rPr>
@@ -505,11 +670,12 @@
     </w:p>
     <w:p>
       <w:pPr>
+        <w:keepNext w:val="0"/>
         <w:numPr>
           <w:ilvl w:val="0"/>
           <w:numId w:val="2"/>
         </w:numPr>
-        <w:spacing w:line="240" w:lineRule="auto" w:after="0" w:before="0"/>
+        <w:spacing w:line="220" w:lineRule="exact" w:after="0" w:before="0"/>
         <w:ind w:hanging="366"/>
         <w:rPr>
           <w:sz w:val="22"/>
@@ -518,6 +684,10 @@
       </w:pPr>
       <w:r>
         <w:rPr>
+          <w:rFonts w:ascii="Times New Roman" w:hAnsi="Times New Roman"/>
+          <w:b w:val="0"/>
+          <w:i w:val="0"/>
+          <w:color w:val="000000"/>
           <w:sz w:val="20"/>
           <w:szCs w:val="22"/>
         </w:rPr>
@@ -526,10 +696,8 @@
     </w:p>
     <w:p>
       <w:pPr>
-        <w:pBdr>
-          <w:bottom w:val="single" w:sz="6" w:space="0" w:color="000000"/>
-        </w:pBdr>
-        <w:spacing w:line="240" w:lineRule="auto" w:after="0" w:before="20"/>
+        <w:keepNext/>
+        <w:spacing w:line="240" w:lineRule="exact" w:after="40" w:before="80"/>
         <w:rPr>
           <w:b/>
           <w:bCs/>
@@ -537,14 +705,20 @@
           <w:sz w:val="22"/>
           <w:szCs w:val="22"/>
         </w:rPr>
+        <w:pBdr>
+          <w:top w:val="single" w:sz="5" w:color="000000" w:space="3"/>
+        </w:pBdr>
       </w:pPr>
       <w:bookmarkStart w:id="20" w:name="1753153782802524"/>
       <w:r>
         <w:rPr>
+          <w:rFonts w:ascii="Times New Roman" w:hAnsi="Times New Roman"/>
           <w:b/>
           <w:bCs/>
+          <w:i w:val="0"/>
           <w:caps/>
-          <w:sz w:val="20"/>
+          <w:color w:val="000000"/>
+          <w:sz w:val="22"/>
           <w:szCs w:val="22"/>
         </w:rPr>
         <w:t>HONORS AND AWARDS</w:t>
@@ -554,18 +728,23 @@
     <w:p>
       <w:pPr>
         <w:pStyle w:val="ListParagraph"/>
+        <w:keepNext w:val="0"/>
         <w:numPr>
           <w:ilvl w:val="0"/>
           <w:numId w:val="8"/>
         </w:numPr>
-        <w:spacing w:line="240" w:lineRule="auto" w:after="0" w:before="0"/>
-        <w:rPr>
-          <w:sz w:val="22"/>
-          <w:szCs w:val="22"/>
-        </w:rPr>
-      </w:pPr>
-      <w:r>
-        <w:rPr>
+        <w:spacing w:line="220" w:lineRule="exact" w:after="0" w:before="0"/>
+        <w:rPr>
+          <w:sz w:val="22"/>
+          <w:szCs w:val="22"/>
+        </w:rPr>
+      </w:pPr>
+      <w:r>
+        <w:rPr>
+          <w:rFonts w:ascii="Times New Roman" w:hAnsi="Times New Roman"/>
+          <w:b w:val="0"/>
+          <w:i w:val="0"/>
+          <w:color w:val="000000"/>
           <w:sz w:val="20"/>
           <w:szCs w:val="22"/>
         </w:rPr>
@@ -575,18 +754,23 @@
     <w:p>
       <w:pPr>
         <w:pStyle w:val="ListParagraph"/>
+        <w:keepNext w:val="0"/>
         <w:numPr>
           <w:ilvl w:val="0"/>
           <w:numId w:val="8"/>
         </w:numPr>
-        <w:spacing w:line="240" w:lineRule="auto" w:after="0" w:before="0"/>
-        <w:rPr>
-          <w:sz w:val="22"/>
-          <w:szCs w:val="22"/>
-        </w:rPr>
-      </w:pPr>
-      <w:r>
-        <w:rPr>
+        <w:spacing w:line="220" w:lineRule="exact" w:after="0" w:before="0"/>
+        <w:rPr>
+          <w:sz w:val="22"/>
+          <w:szCs w:val="22"/>
+        </w:rPr>
+      </w:pPr>
+      <w:r>
+        <w:rPr>
+          <w:rFonts w:ascii="Times New Roman" w:hAnsi="Times New Roman"/>
+          <w:b w:val="0"/>
+          <w:i w:val="0"/>
+          <w:color w:val="000000"/>
           <w:sz w:val="20"/>
           <w:szCs w:val="22"/>
         </w:rPr>
@@ -596,18 +780,23 @@
     <w:p>
       <w:pPr>
         <w:pStyle w:val="ListParagraph"/>
+        <w:keepNext w:val="0"/>
         <w:numPr>
           <w:ilvl w:val="0"/>
           <w:numId w:val="8"/>
         </w:numPr>
-        <w:spacing w:line="240" w:lineRule="auto" w:after="0" w:before="0"/>
-        <w:rPr>
-          <w:sz w:val="22"/>
-          <w:szCs w:val="22"/>
-        </w:rPr>
-      </w:pPr>
-      <w:r>
-        <w:rPr>
+        <w:spacing w:line="220" w:lineRule="exact" w:after="0" w:before="0"/>
+        <w:rPr>
+          <w:sz w:val="22"/>
+          <w:szCs w:val="22"/>
+        </w:rPr>
+      </w:pPr>
+      <w:r>
+        <w:rPr>
+          <w:rFonts w:ascii="Times New Roman" w:hAnsi="Times New Roman"/>
+          <w:b w:val="0"/>
+          <w:i w:val="0"/>
+          <w:color w:val="000000"/>
           <w:sz w:val="20"/>
           <w:szCs w:val="22"/>
         </w:rPr>
@@ -617,18 +806,23 @@
     <w:p>
       <w:pPr>
         <w:pStyle w:val="ListParagraph"/>
+        <w:keepNext w:val="0"/>
         <w:numPr>
           <w:ilvl w:val="0"/>
           <w:numId w:val="8"/>
         </w:numPr>
-        <w:spacing w:line="240" w:lineRule="auto" w:after="0" w:before="0"/>
-        <w:rPr>
-          <w:sz w:val="22"/>
-          <w:szCs w:val="22"/>
-        </w:rPr>
-      </w:pPr>
-      <w:r>
-        <w:rPr>
+        <w:spacing w:line="220" w:lineRule="exact" w:after="0" w:before="0"/>
+        <w:rPr>
+          <w:sz w:val="22"/>
+          <w:szCs w:val="22"/>
+        </w:rPr>
+      </w:pPr>
+      <w:r>
+        <w:rPr>
+          <w:rFonts w:ascii="Times New Roman" w:hAnsi="Times New Roman"/>
+          <w:b w:val="0"/>
+          <w:i w:val="0"/>
+          <w:color w:val="000000"/>
           <w:sz w:val="20"/>
           <w:szCs w:val="22"/>
         </w:rPr>
@@ -638,18 +832,23 @@
     <w:p>
       <w:pPr>
         <w:pStyle w:val="ListParagraph"/>
+        <w:keepNext w:val="0"/>
         <w:numPr>
           <w:ilvl w:val="0"/>
           <w:numId w:val="8"/>
         </w:numPr>
-        <w:spacing w:line="240" w:lineRule="auto" w:after="0" w:before="0"/>
-        <w:rPr>
-          <w:sz w:val="22"/>
-          <w:szCs w:val="22"/>
-        </w:rPr>
-      </w:pPr>
-      <w:r>
-        <w:rPr>
+        <w:spacing w:line="220" w:lineRule="exact" w:after="0" w:before="0"/>
+        <w:rPr>
+          <w:sz w:val="22"/>
+          <w:szCs w:val="22"/>
+        </w:rPr>
+      </w:pPr>
+      <w:r>
+        <w:rPr>
+          <w:rFonts w:ascii="Times New Roman" w:hAnsi="Times New Roman"/>
+          <w:b w:val="0"/>
+          <w:i w:val="0"/>
+          <w:color w:val="000000"/>
           <w:sz w:val="20"/>
           <w:szCs w:val="22"/>
         </w:rPr>
@@ -658,10 +857,8 @@
     </w:p>
     <w:p>
       <w:pPr>
-        <w:pBdr>
-          <w:bottom w:val="single" w:sz="6" w:space="0" w:color="000000"/>
-        </w:pBdr>
-        <w:spacing w:line="240" w:lineRule="auto" w:after="0" w:before="20"/>
+        <w:keepNext/>
+        <w:spacing w:line="240" w:lineRule="exact" w:after="40" w:before="80"/>
         <w:rPr>
           <w:b/>
           <w:bCs/>
@@ -669,13 +866,19 @@
           <w:sz w:val="22"/>
           <w:szCs w:val="22"/>
         </w:rPr>
-      </w:pPr>
-      <w:r>
-        <w:rPr>
+        <w:pBdr>
+          <w:top w:val="single" w:sz="5" w:color="000000" w:space="3"/>
+        </w:pBdr>
+      </w:pPr>
+      <w:r>
+        <w:rPr>
+          <w:rFonts w:ascii="Times New Roman" w:hAnsi="Times New Roman"/>
           <w:b/>
           <w:bCs/>
+          <w:i w:val="0"/>
           <w:caps/>
-          <w:sz w:val="20"/>
+          <w:color w:val="000000"/>
+          <w:sz w:val="22"/>
           <w:szCs w:val="22"/>
         </w:rPr>
         <w:t>VOLUNTEER EXPERIENCE</w:t>
@@ -683,17 +886,22 @@
     </w:p>
     <w:p>
       <w:pPr>
-        <w:tabs>
-          <w:tab w:pos="10787" w:val="right"/>
-        </w:tabs>
-        <w:spacing w:line="240" w:lineRule="auto" w:after="0" w:before="0"/>
-        <w:rPr>
-          <w:sz w:val="22"/>
-          <w:szCs w:val="22"/>
-        </w:rPr>
-      </w:pPr>
-      <w:r>
-        <w:rPr>
+        <w:keepNext/>
+        <w:tabs>
+          <w:tab w:pos="10800" w:val="right"/>
+        </w:tabs>
+        <w:spacing w:line="220" w:lineRule="exact" w:after="0" w:before="40"/>
+        <w:rPr>
+          <w:sz w:val="22"/>
+          <w:szCs w:val="22"/>
+        </w:rPr>
+      </w:pPr>
+      <w:r>
+        <w:rPr>
+          <w:rFonts w:ascii="Times New Roman" w:hAnsi="Times New Roman"/>
+          <w:b w:val="0"/>
+          <w:i w:val="0"/>
+          <w:color w:val="000000"/>
           <w:sz w:val="20"/>
           <w:szCs w:val="22"/>
         </w:rPr>
@@ -705,18 +913,23 @@
     <w:p>
       <w:pPr>
         <w:pStyle w:val="ListParagraph"/>
+        <w:keepNext w:val="0"/>
         <w:numPr>
           <w:ilvl w:val="0"/>
           <w:numId w:val="8"/>
         </w:numPr>
-        <w:spacing w:line="240" w:lineRule="auto" w:after="0" w:before="0"/>
-        <w:rPr>
-          <w:sz w:val="22"/>
-          <w:szCs w:val="22"/>
-        </w:rPr>
-      </w:pPr>
-      <w:r>
-        <w:rPr>
+        <w:spacing w:line="220" w:lineRule="exact" w:after="0" w:before="0"/>
+        <w:rPr>
+          <w:sz w:val="22"/>
+          <w:szCs w:val="22"/>
+        </w:rPr>
+      </w:pPr>
+      <w:r>
+        <w:rPr>
+          <w:rFonts w:ascii="Times New Roman" w:hAnsi="Times New Roman"/>
+          <w:b w:val="0"/>
+          <w:i w:val="0"/>
+          <w:color w:val="000000"/>
           <w:sz w:val="20"/>
           <w:szCs w:val="22"/>
         </w:rPr>
@@ -726,18 +939,23 @@
     <w:p>
       <w:pPr>
         <w:pStyle w:val="ListParagraph"/>
+        <w:keepNext w:val="0"/>
         <w:numPr>
           <w:ilvl w:val="0"/>
           <w:numId w:val="8"/>
         </w:numPr>
-        <w:spacing w:line="240" w:lineRule="auto" w:after="0" w:before="0"/>
-        <w:rPr>
-          <w:sz w:val="22"/>
-          <w:szCs w:val="22"/>
-        </w:rPr>
-      </w:pPr>
-      <w:r>
-        <w:rPr>
+        <w:spacing w:line="220" w:lineRule="exact" w:after="0" w:before="0"/>
+        <w:rPr>
+          <w:sz w:val="22"/>
+          <w:szCs w:val="22"/>
+        </w:rPr>
+      </w:pPr>
+      <w:r>
+        <w:rPr>
+          <w:rFonts w:ascii="Times New Roman" w:hAnsi="Times New Roman"/>
+          <w:b w:val="0"/>
+          <w:i w:val="0"/>
+          <w:color w:val="000000"/>
           <w:sz w:val="20"/>
           <w:szCs w:val="22"/>
         </w:rPr>
@@ -746,17 +964,22 @@
     </w:p>
     <w:p>
       <w:pPr>
-        <w:tabs>
-          <w:tab w:pos="10787" w:val="right"/>
-        </w:tabs>
-        <w:spacing w:line="240" w:lineRule="auto" w:after="0" w:before="0"/>
-        <w:rPr>
-          <w:sz w:val="22"/>
-          <w:szCs w:val="22"/>
-        </w:rPr>
-      </w:pPr>
-      <w:r>
-        <w:rPr>
+        <w:keepNext/>
+        <w:tabs>
+          <w:tab w:pos="10800" w:val="right"/>
+        </w:tabs>
+        <w:spacing w:line="220" w:lineRule="exact" w:after="0" w:before="40"/>
+        <w:rPr>
+          <w:sz w:val="22"/>
+          <w:szCs w:val="22"/>
+        </w:rPr>
+      </w:pPr>
+      <w:r>
+        <w:rPr>
+          <w:rFonts w:ascii="Times New Roman" w:hAnsi="Times New Roman"/>
+          <w:b w:val="0"/>
+          <w:i w:val="0"/>
+          <w:color w:val="000000"/>
           <w:sz w:val="20"/>
           <w:szCs w:val="22"/>
         </w:rPr>
@@ -768,18 +991,23 @@
     <w:p>
       <w:pPr>
         <w:pStyle w:val="ListParagraph"/>
+        <w:keepNext w:val="0"/>
         <w:numPr>
           <w:ilvl w:val="0"/>
           <w:numId w:val="9"/>
         </w:numPr>
-        <w:spacing w:line="240" w:lineRule="auto" w:after="0" w:before="0"/>
-        <w:rPr>
-          <w:sz w:val="22"/>
-          <w:szCs w:val="22"/>
-        </w:rPr>
-      </w:pPr>
-      <w:r>
-        <w:rPr>
+        <w:spacing w:line="220" w:lineRule="exact" w:after="0" w:before="0"/>
+        <w:rPr>
+          <w:sz w:val="22"/>
+          <w:szCs w:val="22"/>
+        </w:rPr>
+      </w:pPr>
+      <w:r>
+        <w:rPr>
+          <w:rFonts w:ascii="Times New Roman" w:hAnsi="Times New Roman"/>
+          <w:b w:val="0"/>
+          <w:i w:val="0"/>
+          <w:color w:val="000000"/>
           <w:sz w:val="20"/>
           <w:szCs w:val="22"/>
         </w:rPr>
@@ -788,17 +1016,22 @@
     </w:p>
     <w:p>
       <w:pPr>
-        <w:tabs>
-          <w:tab w:pos="10787" w:val="right"/>
-        </w:tabs>
-        <w:spacing w:line="240" w:lineRule="auto" w:after="0" w:before="0"/>
-        <w:rPr>
-          <w:sz w:val="22"/>
-          <w:szCs w:val="22"/>
-        </w:rPr>
-      </w:pPr>
-      <w:r>
-        <w:rPr>
+        <w:keepNext/>
+        <w:tabs>
+          <w:tab w:pos="10800" w:val="right"/>
+        </w:tabs>
+        <w:spacing w:line="220" w:lineRule="exact" w:after="0" w:before="40"/>
+        <w:rPr>
+          <w:sz w:val="22"/>
+          <w:szCs w:val="22"/>
+        </w:rPr>
+      </w:pPr>
+      <w:r>
+        <w:rPr>
+          <w:rFonts w:ascii="Times New Roman" w:hAnsi="Times New Roman"/>
+          <w:b w:val="0"/>
+          <w:i w:val="0"/>
+          <w:color w:val="000000"/>
           <w:sz w:val="20"/>
           <w:szCs w:val="22"/>
         </w:rPr>
@@ -810,18 +1043,23 @@
     <w:p>
       <w:pPr>
         <w:pStyle w:val="ListParagraph"/>
+        <w:keepNext w:val="0"/>
         <w:numPr>
           <w:ilvl w:val="0"/>
           <w:numId w:val="9"/>
         </w:numPr>
-        <w:spacing w:line="240" w:lineRule="auto" w:after="0" w:before="0"/>
-        <w:rPr>
-          <w:sz w:val="22"/>
-          <w:szCs w:val="22"/>
-        </w:rPr>
-      </w:pPr>
-      <w:r>
-        <w:rPr>
+        <w:spacing w:line="220" w:lineRule="exact" w:after="0" w:before="0"/>
+        <w:rPr>
+          <w:sz w:val="22"/>
+          <w:szCs w:val="22"/>
+        </w:rPr>
+      </w:pPr>
+      <w:r>
+        <w:rPr>
+          <w:rFonts w:ascii="Times New Roman" w:hAnsi="Times New Roman"/>
+          <w:b w:val="0"/>
+          <w:i w:val="0"/>
+          <w:color w:val="000000"/>
           <w:sz w:val="20"/>
           <w:szCs w:val="22"/>
         </w:rPr>
@@ -830,17 +1068,22 @@
     </w:p>
     <w:p>
       <w:pPr>
-        <w:tabs>
-          <w:tab w:pos="10787" w:val="right"/>
-        </w:tabs>
-        <w:spacing w:line="240" w:lineRule="auto" w:after="0" w:before="0"/>
-        <w:rPr>
-          <w:sz w:val="22"/>
-          <w:szCs w:val="22"/>
-        </w:rPr>
-      </w:pPr>
-      <w:r>
-        <w:rPr>
+        <w:keepNext/>
+        <w:tabs>
+          <w:tab w:pos="10800" w:val="right"/>
+        </w:tabs>
+        <w:spacing w:line="220" w:lineRule="exact" w:after="0" w:before="40"/>
+        <w:rPr>
+          <w:sz w:val="22"/>
+          <w:szCs w:val="22"/>
+        </w:rPr>
+      </w:pPr>
+      <w:r>
+        <w:rPr>
+          <w:rFonts w:ascii="Times New Roman" w:hAnsi="Times New Roman"/>
+          <w:b w:val="0"/>
+          <w:i w:val="0"/>
+          <w:color w:val="000000"/>
           <w:sz w:val="20"/>
           <w:szCs w:val="22"/>
         </w:rPr>
@@ -852,18 +1095,23 @@
     <w:p>
       <w:pPr>
         <w:pStyle w:val="ListParagraph"/>
+        <w:keepNext w:val="0"/>
         <w:numPr>
           <w:ilvl w:val="0"/>
           <w:numId w:val="9"/>
         </w:numPr>
-        <w:spacing w:line="240" w:lineRule="auto" w:after="0" w:before="0"/>
-        <w:rPr>
-          <w:sz w:val="22"/>
-          <w:szCs w:val="22"/>
-        </w:rPr>
-      </w:pPr>
-      <w:r>
-        <w:rPr>
+        <w:spacing w:line="220" w:lineRule="exact" w:after="0" w:before="0"/>
+        <w:rPr>
+          <w:sz w:val="22"/>
+          <w:szCs w:val="22"/>
+        </w:rPr>
+      </w:pPr>
+      <w:r>
+        <w:rPr>
+          <w:rFonts w:ascii="Times New Roman" w:hAnsi="Times New Roman"/>
+          <w:b w:val="0"/>
+          <w:i w:val="0"/>
+          <w:color w:val="000000"/>
           <w:sz w:val="20"/>
           <w:szCs w:val="22"/>
         </w:rPr>
@@ -872,10 +1120,8 @@
     </w:p>
     <w:p>
       <w:pPr>
-        <w:pBdr>
-          <w:bottom w:val="single" w:sz="6" w:space="0" w:color="000000"/>
-        </w:pBdr>
-        <w:spacing w:line="240" w:lineRule="auto" w:after="0" w:before="20"/>
+        <w:keepNext/>
+        <w:spacing w:line="240" w:lineRule="exact" w:after="40" w:before="80"/>
         <w:rPr>
           <w:b/>
           <w:bCs/>
@@ -883,14 +1129,20 @@
           <w:sz w:val="22"/>
           <w:szCs w:val="22"/>
         </w:rPr>
+        <w:pBdr>
+          <w:top w:val="single" w:sz="5" w:color="000000" w:space="3"/>
+        </w:pBdr>
       </w:pPr>
       <w:bookmarkStart w:id="33" w:name="2263511450226040"/>
       <w:r>
         <w:rPr>
+          <w:rFonts w:ascii="Times New Roman" w:hAnsi="Times New Roman"/>
           <w:b/>
           <w:bCs/>
+          <w:i w:val="0"/>
           <w:caps/>
-          <w:sz w:val="20"/>
+          <w:color w:val="000000"/>
+          <w:sz w:val="22"/>
           <w:szCs w:val="22"/>
         </w:rPr>
         <w:t>LEADERSHIP AND ACTIVITIES</w:t>
@@ -899,10 +1151,11 @@
     </w:p>
     <w:p>
       <w:pPr>
-        <w:tabs>
-          <w:tab w:pos="10787" w:val="right"/>
-        </w:tabs>
-        <w:spacing w:line="240" w:lineRule="auto" w:after="0" w:before="0"/>
+        <w:keepNext/>
+        <w:tabs>
+          <w:tab w:pos="10800" w:val="right"/>
+        </w:tabs>
+        <w:spacing w:line="220" w:lineRule="exact" w:after="0" w:before="40"/>
         <w:rPr>
           <w:sz w:val="22"/>
           <w:szCs w:val="22"/>
@@ -911,8 +1164,10 @@
       <w:r>
         <w:rPr>
           <w:rStyle w:val="fs14fw4"/>
-          <w:b w:val="0"/>
-          <w:i w:val="0"/>
+          <w:rFonts w:ascii="Times New Roman" w:hAnsi="Times New Roman"/>
+          <w:b w:val="0"/>
+          <w:i w:val="0"/>
+          <w:color w:val="000000"/>
           <w:sz w:val="20"/>
           <w:szCs w:val="22"/>
         </w:rPr>
@@ -923,11 +1178,12 @@
     </w:p>
     <w:p>
       <w:pPr>
+        <w:keepNext w:val="0"/>
         <w:numPr>
           <w:ilvl w:val="0"/>
           <w:numId w:val="5"/>
         </w:numPr>
-        <w:spacing w:line="240" w:lineRule="auto" w:after="0" w:before="0"/>
+        <w:spacing w:line="220" w:lineRule="exact" w:after="0" w:before="0"/>
         <w:ind w:hanging="366"/>
         <w:rPr>
           <w:sz w:val="22"/>
@@ -936,6 +1192,10 @@
       </w:pPr>
       <w:r>
         <w:rPr>
+          <w:rFonts w:ascii="Times New Roman" w:hAnsi="Times New Roman"/>
+          <w:b w:val="0"/>
+          <w:i w:val="0"/>
+          <w:color w:val="000000"/>
           <w:sz w:val="20"/>
           <w:szCs w:val="22"/>
         </w:rPr>
@@ -944,10 +1204,11 @@
     </w:p>
     <w:p>
       <w:pPr>
-        <w:tabs>
-          <w:tab w:pos="10787" w:val="right"/>
-        </w:tabs>
-        <w:spacing w:line="240" w:lineRule="auto" w:after="0" w:before="0"/>
+        <w:keepNext/>
+        <w:tabs>
+          <w:tab w:pos="10800" w:val="right"/>
+        </w:tabs>
+        <w:spacing w:line="220" w:lineRule="exact" w:after="0" w:before="40"/>
         <w:rPr>
           <w:sz w:val="22"/>
           <w:szCs w:val="22"/>
@@ -956,8 +1217,10 @@
       <w:r>
         <w:rPr>
           <w:rStyle w:val="fs14fw4"/>
-          <w:b w:val="0"/>
-          <w:i w:val="0"/>
+          <w:rFonts w:ascii="Times New Roman" w:hAnsi="Times New Roman"/>
+          <w:b w:val="0"/>
+          <w:i w:val="0"/>
+          <w:color w:val="000000"/>
           <w:sz w:val="20"/>
           <w:szCs w:val="22"/>
         </w:rPr>
@@ -968,11 +1231,12 @@
     </w:p>
     <w:p>
       <w:pPr>
+        <w:keepNext w:val="0"/>
         <w:numPr>
           <w:ilvl w:val="0"/>
           <w:numId w:val="5"/>
         </w:numPr>
-        <w:spacing w:line="240" w:lineRule="auto" w:after="0" w:before="0"/>
+        <w:spacing w:line="220" w:lineRule="exact" w:after="0" w:before="0"/>
         <w:ind w:hanging="366"/>
         <w:rPr>
           <w:sz w:val="22"/>
@@ -981,6 +1245,10 @@
       </w:pPr>
       <w:r>
         <w:rPr>
+          <w:rFonts w:ascii="Times New Roman" w:hAnsi="Times New Roman"/>
+          <w:b w:val="0"/>
+          <w:i w:val="0"/>
+          <w:color w:val="000000"/>
           <w:sz w:val="20"/>
           <w:szCs w:val="22"/>
         </w:rPr>
@@ -989,10 +1257,11 @@
     </w:p>
     <w:p>
       <w:pPr>
-        <w:tabs>
-          <w:tab w:pos="10787" w:val="right"/>
-        </w:tabs>
-        <w:spacing w:line="240" w:lineRule="auto" w:after="0" w:before="0"/>
+        <w:keepNext/>
+        <w:tabs>
+          <w:tab w:pos="10800" w:val="right"/>
+        </w:tabs>
+        <w:spacing w:line="220" w:lineRule="exact" w:after="0" w:before="40"/>
         <w:rPr>
           <w:sz w:val="22"/>
           <w:szCs w:val="22"/>
@@ -1001,8 +1270,10 @@
       <w:r>
         <w:rPr>
           <w:rStyle w:val="fs14fw4"/>
-          <w:b w:val="0"/>
-          <w:i w:val="0"/>
+          <w:rFonts w:ascii="Times New Roman" w:hAnsi="Times New Roman"/>
+          <w:b w:val="0"/>
+          <w:i w:val="0"/>
+          <w:color w:val="000000"/>
           <w:sz w:val="20"/>
           <w:szCs w:val="22"/>
         </w:rPr>
@@ -1013,11 +1284,12 @@
     </w:p>
     <w:p>
       <w:pPr>
+        <w:keepNext w:val="0"/>
         <w:numPr>
           <w:ilvl w:val="0"/>
           <w:numId w:val="5"/>
         </w:numPr>
-        <w:spacing w:line="240" w:lineRule="auto" w:after="0" w:before="0"/>
+        <w:spacing w:line="220" w:lineRule="exact" w:after="0" w:before="0"/>
         <w:ind w:hanging="366"/>
         <w:rPr>
           <w:sz w:val="22"/>
@@ -1026,6 +1298,10 @@
       </w:pPr>
       <w:r>
         <w:rPr>
+          <w:rFonts w:ascii="Times New Roman" w:hAnsi="Times New Roman"/>
+          <w:b w:val="0"/>
+          <w:i w:val="0"/>
+          <w:color w:val="000000"/>
           <w:sz w:val="20"/>
           <w:szCs w:val="22"/>
         </w:rPr>
@@ -1034,10 +1310,11 @@
     </w:p>
     <w:p>
       <w:pPr>
-        <w:tabs>
-          <w:tab w:pos="10787" w:val="right"/>
-        </w:tabs>
-        <w:spacing w:line="240" w:lineRule="auto" w:after="0" w:before="0"/>
+        <w:keepNext/>
+        <w:tabs>
+          <w:tab w:pos="10800" w:val="right"/>
+        </w:tabs>
+        <w:spacing w:line="220" w:lineRule="exact" w:after="0" w:before="40"/>
         <w:rPr>
           <w:sz w:val="22"/>
           <w:szCs w:val="22"/>
@@ -1046,8 +1323,10 @@
       <w:r>
         <w:rPr>
           <w:rStyle w:val="fs14fw4"/>
-          <w:b w:val="0"/>
-          <w:i w:val="0"/>
+          <w:rFonts w:ascii="Times New Roman" w:hAnsi="Times New Roman"/>
+          <w:b w:val="0"/>
+          <w:i w:val="0"/>
+          <w:color w:val="000000"/>
           <w:sz w:val="20"/>
           <w:szCs w:val="22"/>
         </w:rPr>
@@ -1058,11 +1337,12 @@
     </w:p>
     <w:p>
       <w:pPr>
+        <w:keepNext w:val="0"/>
         <w:numPr>
           <w:ilvl w:val="0"/>
           <w:numId w:val="5"/>
         </w:numPr>
-        <w:spacing w:line="240" w:lineRule="auto" w:after="0" w:before="0"/>
+        <w:spacing w:line="220" w:lineRule="exact" w:after="0" w:before="0"/>
         <w:ind w:hanging="366"/>
         <w:rPr>
           <w:sz w:val="22"/>
@@ -1071,6 +1351,10 @@
       </w:pPr>
       <w:r>
         <w:rPr>
+          <w:rFonts w:ascii="Times New Roman" w:hAnsi="Times New Roman"/>
+          <w:b w:val="0"/>
+          <w:i w:val="0"/>
+          <w:color w:val="000000"/>
           <w:sz w:val="20"/>
           <w:szCs w:val="22"/>
         </w:rPr>
@@ -1079,10 +1363,8 @@
     </w:p>
     <w:p>
       <w:pPr>
-        <w:pBdr>
-          <w:bottom w:val="single" w:sz="6" w:space="0" w:color="000000"/>
-        </w:pBdr>
-        <w:spacing w:line="240" w:lineRule="auto" w:after="0" w:before="20"/>
+        <w:keepNext/>
+        <w:spacing w:line="240" w:lineRule="exact" w:after="40" w:before="80"/>
         <w:rPr>
           <w:b/>
           <w:bCs/>
@@ -1090,14 +1372,20 @@
           <w:sz w:val="22"/>
           <w:szCs w:val="22"/>
         </w:rPr>
+        <w:pBdr>
+          <w:top w:val="single" w:sz="5" w:color="000000" w:space="3"/>
+        </w:pBdr>
       </w:pPr>
       <w:bookmarkStart w:id="40" w:name="381786091174206"/>
       <w:r>
         <w:rPr>
+          <w:rFonts w:ascii="Times New Roman" w:hAnsi="Times New Roman"/>
           <w:b/>
           <w:bCs/>
+          <w:i w:val="0"/>
           <w:caps/>
-          <w:sz w:val="20"/>
+          <w:color w:val="000000"/>
+          <w:sz w:val="22"/>
           <w:szCs w:val="22"/>
         </w:rPr>
         <w:t>TECHNICAL SKILLS AND CERTIFICATIONS</w:t>
@@ -1105,21 +1393,25 @@
       <w:bookmarkEnd w:id="40"/>
       <w:r>
         <w:rPr>
+          <w:rFonts w:ascii="Times New Roman" w:hAnsi="Times New Roman"/>
           <w:b/>
           <w:bCs/>
+          <w:i w:val="0"/>
           <w:caps/>
-          <w:sz w:val="20"/>
-          <w:szCs w:val="22"/>
-        </w:rPr>
-      </w:r>
-    </w:p>
-    <w:p>
-      <w:pPr>
+          <w:color w:val="000000"/>
+          <w:sz w:val="22"/>
+          <w:szCs w:val="22"/>
+        </w:rPr>
+      </w:r>
+    </w:p>
+    <w:p>
+      <w:pPr>
+        <w:keepNext w:val="0"/>
         <w:numPr>
           <w:ilvl w:val="0"/>
           <w:numId w:val="7"/>
         </w:numPr>
-        <w:spacing w:line="240" w:lineRule="auto" w:after="0" w:before="0"/>
+        <w:spacing w:line="220" w:lineRule="exact" w:after="0" w:before="0"/>
         <w:ind w:hanging="366"/>
         <w:rPr>
           <w:sz w:val="22"/>
@@ -1129,6 +1421,10 @@
       <w:bookmarkStart w:id="41" w:name="div_85"/>
       <w:r>
         <w:rPr>
+          <w:rFonts w:ascii="Times New Roman" w:hAnsi="Times New Roman"/>
+          <w:b w:val="0"/>
+          <w:i w:val="0"/>
+          <w:color w:val="000000"/>
           <w:sz w:val="20"/>
           <w:szCs w:val="22"/>
         </w:rPr>
@@ -1138,11 +1434,12 @@
     </w:p>
     <w:p>
       <w:pPr>
+        <w:keepNext w:val="0"/>
         <w:numPr>
           <w:ilvl w:val="0"/>
           <w:numId w:val="7"/>
         </w:numPr>
-        <w:spacing w:line="240" w:lineRule="auto" w:after="0" w:before="0"/>
+        <w:spacing w:line="220" w:lineRule="exact" w:after="0" w:before="0"/>
         <w:ind w:hanging="366"/>
         <w:rPr>
           <w:sz w:val="22"/>
@@ -1152,6 +1449,10 @@
       <w:bookmarkStart w:id="42" w:name="div_86"/>
       <w:r>
         <w:rPr>
+          <w:rFonts w:ascii="Times New Roman" w:hAnsi="Times New Roman"/>
+          <w:b w:val="0"/>
+          <w:i w:val="0"/>
+          <w:color w:val="000000"/>
           <w:sz w:val="20"/>
           <w:szCs w:val="22"/>
         </w:rPr>
@@ -1161,11 +1462,12 @@
     </w:p>
     <w:p>
       <w:pPr>
+        <w:keepNext w:val="0"/>
         <w:numPr>
           <w:ilvl w:val="0"/>
           <w:numId w:val="7"/>
         </w:numPr>
-        <w:spacing w:line="240" w:lineRule="auto" w:after="0" w:before="0"/>
+        <w:spacing w:line="220" w:lineRule="exact" w:after="0" w:before="0"/>
         <w:ind w:hanging="366"/>
         <w:rPr>
           <w:sz w:val="22"/>
@@ -1175,6 +1477,10 @@
       <w:bookmarkStart w:id="43" w:name="div_87"/>
       <w:r>
         <w:rPr>
+          <w:rFonts w:ascii="Times New Roman" w:hAnsi="Times New Roman"/>
+          <w:b w:val="0"/>
+          <w:i w:val="0"/>
+          <w:color w:val="000000"/>
           <w:sz w:val="20"/>
           <w:szCs w:val="22"/>
         </w:rPr>
@@ -1184,11 +1490,12 @@
     </w:p>
     <w:p>
       <w:pPr>
+        <w:keepNext w:val="0"/>
         <w:numPr>
           <w:ilvl w:val="0"/>
           <w:numId w:val="7"/>
         </w:numPr>
-        <w:spacing w:line="240" w:lineRule="auto" w:after="0" w:before="0"/>
+        <w:spacing w:line="220" w:lineRule="exact" w:after="0" w:before="0"/>
         <w:ind w:hanging="366"/>
         <w:rPr>
           <w:sz w:val="22"/>
@@ -1197,6 +1504,10 @@
       </w:pPr>
       <w:r>
         <w:rPr>
+          <w:rFonts w:ascii="Times New Roman" w:hAnsi="Times New Roman"/>
+          <w:b w:val="0"/>
+          <w:i w:val="0"/>
+          <w:color w:val="000000"/>
           <w:sz w:val="20"/>
           <w:szCs w:val="22"/>
         </w:rPr>
@@ -1205,11 +1516,12 @@
     </w:p>
     <w:p>
       <w:pPr>
+        <w:keepNext w:val="0"/>
         <w:numPr>
           <w:ilvl w:val="0"/>
           <w:numId w:val="7"/>
         </w:numPr>
-        <w:spacing w:line="240" w:lineRule="auto" w:after="0" w:before="0"/>
+        <w:spacing w:line="220" w:lineRule="exact" w:after="0" w:before="0"/>
         <w:ind w:hanging="366"/>
         <w:rPr>
           <w:sz w:val="22"/>
@@ -1218,6 +1530,10 @@
       </w:pPr>
       <w:r>
         <w:rPr>
+          <w:rFonts w:ascii="Times New Roman" w:hAnsi="Times New Roman"/>
+          <w:b w:val="0"/>
+          <w:i w:val="0"/>
+          <w:color w:val="000000"/>
           <w:sz w:val="20"/>
           <w:szCs w:val="22"/>
         </w:rPr>
@@ -1226,11 +1542,12 @@
     </w:p>
     <w:p>
       <w:pPr>
+        <w:keepNext w:val="0"/>
         <w:numPr>
           <w:ilvl w:val="0"/>
           <w:numId w:val="7"/>
         </w:numPr>
-        <w:spacing w:line="240" w:lineRule="auto" w:after="0" w:before="0"/>
+        <w:spacing w:line="220" w:lineRule="exact" w:after="0" w:before="0"/>
         <w:ind w:hanging="366"/>
         <w:rPr>
           <w:sz w:val="22"/>
@@ -1239,6 +1556,10 @@
       </w:pPr>
       <w:r>
         <w:rPr>
+          <w:rFonts w:ascii="Times New Roman" w:hAnsi="Times New Roman"/>
+          <w:b w:val="0"/>
+          <w:i w:val="0"/>
+          <w:color w:val="000000"/>
           <w:sz w:val="20"/>
           <w:szCs w:val="22"/>
         </w:rPr>
@@ -1247,11 +1568,12 @@
     </w:p>
     <w:p>
       <w:pPr>
+        <w:keepNext w:val="0"/>
         <w:numPr>
           <w:ilvl w:val="0"/>
           <w:numId w:val="7"/>
         </w:numPr>
-        <w:spacing w:line="240" w:lineRule="auto" w:after="0" w:before="0"/>
+        <w:spacing w:line="220" w:lineRule="exact" w:after="0" w:before="0"/>
         <w:ind w:hanging="366"/>
         <w:rPr>
           <w:sz w:val="22"/>
@@ -1260,6 +1582,10 @@
       </w:pPr>
       <w:r>
         <w:rPr>
+          <w:rFonts w:ascii="Times New Roman" w:hAnsi="Times New Roman"/>
+          <w:b w:val="0"/>
+          <w:i w:val="0"/>
+          <w:color w:val="000000"/>
           <w:sz w:val="20"/>
           <w:szCs w:val="22"/>
         </w:rPr>
@@ -1268,11 +1594,12 @@
     </w:p>
     <w:p>
       <w:pPr>
+        <w:keepNext w:val="0"/>
         <w:numPr>
           <w:ilvl w:val="0"/>
           <w:numId w:val="7"/>
         </w:numPr>
-        <w:spacing w:line="240" w:lineRule="auto" w:after="0" w:before="0"/>
+        <w:spacing w:line="220" w:lineRule="exact" w:after="0" w:before="0"/>
         <w:ind w:hanging="366"/>
         <w:rPr>
           <w:sz w:val="22"/>
@@ -1281,6 +1608,10 @@
       </w:pPr>
       <w:r>
         <w:rPr>
+          <w:rFonts w:ascii="Times New Roman" w:hAnsi="Times New Roman"/>
+          <w:b w:val="0"/>
+          <w:i w:val="0"/>
+          <w:color w:val="000000"/>
           <w:sz w:val="20"/>
           <w:szCs w:val="22"/>
         </w:rPr>
@@ -1289,11 +1620,12 @@
     </w:p>
     <w:p>
       <w:pPr>
+        <w:keepNext w:val="0"/>
         <w:numPr>
           <w:ilvl w:val="0"/>
           <w:numId w:val="7"/>
         </w:numPr>
-        <w:spacing w:line="240" w:lineRule="auto" w:after="0" w:before="0"/>
+        <w:spacing w:line="220" w:lineRule="exact" w:after="0" w:before="0"/>
         <w:ind w:hanging="366"/>
         <w:rPr>
           <w:sz w:val="22"/>
@@ -1302,6 +1634,10 @@
       </w:pPr>
       <w:r>
         <w:rPr>
+          <w:rFonts w:ascii="Times New Roman" w:hAnsi="Times New Roman"/>
+          <w:b w:val="0"/>
+          <w:i w:val="0"/>
+          <w:color w:val="000000"/>
           <w:sz w:val="20"/>
           <w:szCs w:val="22"/>
         </w:rPr>
@@ -1310,7 +1646,7 @@
     </w:p>
     <w:sectPr>
       <w:pgSz w:w="12225" w:h="15810"/>
-      <w:pgMar w:top="719" w:right="719" w:bottom="719" w:left="719" w:header="708" w:footer="708" w:gutter="0"/>
+      <w:pgMar w:top="720" w:right="720" w:bottom="720" w:left="720" w:header="708" w:footer="708" w:gutter="0"/>
       <w:cols w:space="708"/>
     </w:sectPr>
   </w:body>

</xml_diff>